<commit_message>
docs: quitar las rutas con usuario local de docs/
docs/modo-de-uso.md: el cd del Paso 1 usa {ruta-del-proyecto}.
docs/workflow.md: la ruta de config.json usa $env:APPDATA.
docs/modo-de-uso.docx regenerado desde el .md (144 párrafos, sin ruta local).
Se verificó que openspec init corre en una carpeta de prueba siguiendo el Paso 1.
Resuelve la sugerencia del verify de doc-folder-business-rules.

Spec-ID: docs-portable-paths

Co-Authored-By: Claude Sonnet 5 <noreply@anthropic.com>
</commit_message>
<xml_diff>
--- a/docs/modo-de-uso.docx
+++ b/docs/modo-de-uso.docx
@@ -63,7 +63,7 @@
         <w:rPr>
           <w:rStyle w:val="CdigoHTML"/>
         </w:rPr>
-        <w:t>cd "C:\Users\analistapi\Desktop\Proyectos\{nombre-proyecto}"</w:t>
+        <w:t>cd "{ruta-del-proyecto}"</w:t>
       </w:r>
     </w:p>
     <w:p>
@@ -181,7 +181,7 @@
     <w:p>
       <w:pPr>
         <w:pStyle w:val="NormalWeb"/>
-        <w:divId w:val="616134484"/>
+        <w:divId w:val="2146853163"/>
       </w:pPr>
       <w:r>
         <w:rPr>
@@ -450,7 +450,7 @@
         <w:rPr>
           <w:rFonts w:eastAsia="Times New Roman"/>
         </w:rPr>
-        <w:pict w14:anchorId="78ABEE39">
+        <w:pict w14:anchorId="671DF9DF">
           <v:rect id="_x0000_i1025" style="width:0;height:1.5pt" o:hralign="center" o:hrstd="t" o:hr="t" fillcolor="#a0a0a0" stroked="f"/>
         </w:pict>
       </w:r>
@@ -647,7 +647,7 @@
         <w:rPr>
           <w:rFonts w:eastAsia="Times New Roman"/>
         </w:rPr>
-        <w:pict w14:anchorId="76DEEC87">
+        <w:pict w14:anchorId="0407C206">
           <v:rect id="_x0000_i1026" style="width:0;height:1.5pt" o:hralign="center" o:hrstd="t" o:hr="t" fillcolor="#a0a0a0" stroked="f"/>
         </w:pict>
       </w:r>
@@ -1281,7 +1281,7 @@
         <w:rPr>
           <w:rFonts w:eastAsia="Times New Roman"/>
         </w:rPr>
-        <w:pict w14:anchorId="6124DF91">
+        <w:pict w14:anchorId="38AB03C5">
           <v:rect id="_x0000_i1027" style="width:0;height:1.5pt" o:hralign="center" o:hrstd="t" o:hr="t" fillcolor="#a0a0a0" stroked="f"/>
         </w:pict>
       </w:r>
@@ -1459,19 +1459,7 @@
         <w:rPr>
           <w:rFonts w:eastAsia="Times New Roman"/>
         </w:rPr>
-        <w:t xml:space="preserve"> </w:t>
-      </w:r>
-      <w:r>
-        <w:rPr>
-          <w:rFonts w:eastAsia="Times New Roman"/>
-        </w:rPr>
-        <w:t>→</w:t>
-      </w:r>
-      <w:r>
-        <w:rPr>
-          <w:rFonts w:eastAsia="Times New Roman"/>
-        </w:rPr>
-        <w:t xml:space="preserve"> </w:t>
+        <w:t xml:space="preserve"> → </w:t>
       </w:r>
       <w:r>
         <w:rPr>
@@ -1496,7 +1484,7 @@
         <w:rPr>
           <w:rFonts w:eastAsia="Times New Roman"/>
         </w:rPr>
-        <w:pict w14:anchorId="5EA1A680">
+        <w:pict w14:anchorId="13BC8120">
           <v:rect id="_x0000_i1028" style="width:0;height:1.5pt" o:hralign="center" o:hrstd="t" o:hr="t" fillcolor="#a0a0a0" stroked="f"/>
         </w:pict>
       </w:r>
@@ -1885,7 +1873,7 @@
         <w:rPr>
           <w:rFonts w:eastAsia="Times New Roman"/>
         </w:rPr>
-        <w:pict w14:anchorId="7A7D5AC2">
+        <w:pict w14:anchorId="41B252F6">
           <v:rect id="_x0000_i1029" style="width:0;height:1.5pt" o:hralign="center" o:hrstd="t" o:hr="t" fillcolor="#a0a0a0" stroked="f"/>
         </w:pict>
       </w:r>
@@ -1977,13 +1965,7 @@
         <w:rPr>
           <w:rStyle w:val="CdigoHTML"/>
         </w:rPr>
-        <w:t xml:space="preserve">    reglas-globales.md              </w:t>
-      </w:r>
-      <w:r>
-        <w:rPr>
-          <w:rStyle w:val="CdigoHTML"/>
-        </w:rPr>
-        <w:t>← espejo del CLAUDE.md global (lo lee el Agente)</w:t>
+        <w:t xml:space="preserve">    reglas-globales.md              ← espejo del CLAUDE.md global (lo lee el Agente)</w:t>
       </w:r>
     </w:p>
     <w:p>
@@ -2025,13 +2007,7 @@
         <w:rPr>
           <w:rStyle w:val="CdigoHTML"/>
         </w:rPr>
-        <w:t xml:space="preserve">      _index.md                     </w:t>
-      </w:r>
-      <w:r>
-        <w:rPr>
-          <w:rStyle w:val="CdigoHTML"/>
-        </w:rPr>
-        <w:t>← índice con links a todos los changes</w:t>
+        <w:t xml:space="preserve">      _index.md                     ← índice con links a todos los changes</w:t>
       </w:r>
     </w:p>
     <w:p>
@@ -2079,13 +2055,7 @@
         <w:rPr>
           <w:rStyle w:val="CdigoHTML"/>
         </w:rPr>
-        <w:t xml:space="preserve">        YYYY-MM-DD-{change}.md      </w:t>
-      </w:r>
-      <w:r>
-        <w:rPr>
-          <w:rStyle w:val="CdigoHTML"/>
-        </w:rPr>
-        <w:t>← creada al propose</w:t>
+        <w:t xml:space="preserve">        YYYY-MM-DD-{change}.md      ← creada al propose</w:t>
       </w:r>
     </w:p>
     <w:p>
@@ -2113,13 +2083,7 @@
         <w:rPr>
           <w:rStyle w:val="CdigoHTML"/>
         </w:rPr>
-        <w:t xml:space="preserve">        YYYY-MM-DD-{change}.md      </w:t>
-      </w:r>
-      <w:r>
-        <w:rPr>
-          <w:rStyle w:val="CdigoHTML"/>
-        </w:rPr>
-        <w:t>← creada al archive</w:t>
+        <w:t xml:space="preserve">        YYYY-MM-DD-{change}.md      ← creada al archive</w:t>
       </w:r>
     </w:p>
     <w:p>
@@ -3023,9 +2987,9 @@
 <file path=word/numbering.xml><?xml version="1.0" encoding="utf-8"?>
 <w:numbering xmlns:wpc="http://schemas.microsoft.com/office/word/2010/wordprocessingCanvas" xmlns:cx="http://schemas.microsoft.com/office/drawing/2014/chartex" xmlns:cx1="http://schemas.microsoft.com/office/drawing/2015/9/8/chartex" xmlns:cx2="http://schemas.microsoft.com/office/drawing/2015/10/21/chartex" xmlns:cx3="http://schemas.microsoft.com/office/drawing/2016/5/9/chartex" xmlns:cx4="http://schemas.microsoft.com/office/drawing/2016/5/10/chartex" xmlns:cx5="http://schemas.microsoft.com/office/drawing/2016/5/11/chartex" xmlns:cx6="http://schemas.microsoft.com/office/drawing/2016/5/12/chartex" xmlns:cx7="http://schemas.microsoft.com/office/drawing/2016/5/13/chartex" xmlns:cx8="http://schemas.microsoft.com/office/drawing/2016/5/14/chartex" xmlns:mc="http://schemas.openxmlformats.org/markup-compatibility/2006" xmlns:aink="http://schemas.microsoft.com/office/drawing/2016/ink" xmlns:am3d="http://schemas.microsoft.com/office/drawing/2017/model3d" xmlns:o="urn:schemas-microsoft-com:office:office" xmlns:oel="http://schemas.microsoft.com/office/2019/extlst" xmlns:r="http://schemas.openxmlformats.org/officeDocument/2006/relationships" xmlns:m="http://schemas.openxmlformats.org/officeDocument/2006/math" xmlns:v="urn:schemas-microsoft-com:vml" xmlns:wp14="http://schemas.microsoft.com/office/word/2010/wordprocessingDrawing" xmlns:wp="http://schemas.openxmlformats.org/drawingml/2006/wordprocessingDrawing" xmlns:w10="urn:schemas-microsoft-com:office:word" xmlns:w="http://schemas.openxmlformats.org/wordprocessingml/2006/main" xmlns:w14="http://schemas.microsoft.com/office/word/2010/wordml" xmlns:w15="http://schemas.microsoft.com/office/word/2012/wordml" xmlns:w16cex="http://schemas.microsoft.com/office/word/2018/wordml/cex" xmlns:w16cid="http://schemas.microsoft.com/office/word/2016/wordml/cid" xmlns:w16="http://schemas.microsoft.com/office/word/2018/wordml" xmlns:w16du="http://schemas.microsoft.com/office/word/2023/wordml/word16du" xmlns:w16sdtdh="http://schemas.microsoft.com/office/word/2020/wordml/sdtdatahash" xmlns:w16sdtfl="http://schemas.microsoft.com/office/word/2024/wordml/sdtformatlock" xmlns:w16se="http://schemas.microsoft.com/office/word/2015/wordml/symex" xmlns:wpg="http://schemas.microsoft.com/office/word/2010/wordprocessingGroup" xmlns:wpi="http://schemas.microsoft.com/office/word/2010/wordprocessingInk" xmlns:wne="http://schemas.microsoft.com/office/word/2006/wordml" xmlns:wps="http://schemas.microsoft.com/office/word/2010/wordprocessingShape" mc:Ignorable="w14 w15 w16se w16cid w16 w16cex w16sdtdh w16sdtfl w16du wp14">
   <w:abstractNum w:abstractNumId="0" w15:restartNumberingAfterBreak="0">
-    <w:nsid w:val="040F71A1"/>
+    <w:nsid w:val="07A911EC"/>
     <w:multiLevelType w:val="multilevel"/>
-    <w:tmpl w:val="D4FA3C7E"/>
+    <w:tmpl w:val="5D4ED5F6"/>
     <w:lvl w:ilvl="0">
       <w:start w:val="1"/>
       <w:numFmt w:val="bullet"/>
@@ -3172,9 +3136,9 @@
     </w:lvl>
   </w:abstractNum>
   <w:abstractNum w:abstractNumId="1" w15:restartNumberingAfterBreak="0">
-    <w:nsid w:val="248412D6"/>
+    <w:nsid w:val="27355329"/>
     <w:multiLevelType w:val="multilevel"/>
-    <w:tmpl w:val="C1BA92D2"/>
+    <w:tmpl w:val="12882ACC"/>
     <w:lvl w:ilvl="0">
       <w:start w:val="1"/>
       <w:numFmt w:val="bullet"/>
@@ -3321,9 +3285,9 @@
     </w:lvl>
   </w:abstractNum>
   <w:abstractNum w:abstractNumId="2" w15:restartNumberingAfterBreak="0">
-    <w:nsid w:val="382E7BF1"/>
+    <w:nsid w:val="4641642B"/>
     <w:multiLevelType w:val="multilevel"/>
-    <w:tmpl w:val="39DAC9B2"/>
+    <w:tmpl w:val="9F0C14FE"/>
     <w:lvl w:ilvl="0">
       <w:start w:val="1"/>
       <w:numFmt w:val="bullet"/>
@@ -3470,9 +3434,9 @@
     </w:lvl>
   </w:abstractNum>
   <w:abstractNum w:abstractNumId="3" w15:restartNumberingAfterBreak="0">
-    <w:nsid w:val="438059BD"/>
+    <w:nsid w:val="5A6A5F49"/>
     <w:multiLevelType w:val="multilevel"/>
-    <w:tmpl w:val="FAC2AC7A"/>
+    <w:tmpl w:val="9D0A0D5C"/>
     <w:lvl w:ilvl="0">
       <w:start w:val="1"/>
       <w:numFmt w:val="bullet"/>
@@ -3619,9 +3583,9 @@
     </w:lvl>
   </w:abstractNum>
   <w:abstractNum w:abstractNumId="4" w15:restartNumberingAfterBreak="0">
-    <w:nsid w:val="5A0D7C1F"/>
+    <w:nsid w:val="682A6D07"/>
     <w:multiLevelType w:val="multilevel"/>
-    <w:tmpl w:val="0DEA0F48"/>
+    <w:tmpl w:val="CE2CFE3C"/>
     <w:lvl w:ilvl="0">
       <w:start w:val="1"/>
       <w:numFmt w:val="bullet"/>
@@ -3768,9 +3732,9 @@
     </w:lvl>
   </w:abstractNum>
   <w:abstractNum w:abstractNumId="5" w15:restartNumberingAfterBreak="0">
-    <w:nsid w:val="654006D0"/>
+    <w:nsid w:val="7B75148F"/>
     <w:multiLevelType w:val="multilevel"/>
-    <w:tmpl w:val="19982F32"/>
+    <w:tmpl w:val="D63C4774"/>
     <w:lvl w:ilvl="0">
       <w:start w:val="1"/>
       <w:numFmt w:val="bullet"/>
@@ -3916,23 +3880,23 @@
       </w:rPr>
     </w:lvl>
   </w:abstractNum>
-  <w:num w:numId="1" w16cid:durableId="195511342">
+  <w:num w:numId="1" w16cid:durableId="1618488193">
+    <w:abstractNumId w:val="2"/>
+  </w:num>
+  <w:num w:numId="2" w16cid:durableId="767190259">
+    <w:abstractNumId w:val="1"/>
+  </w:num>
+  <w:num w:numId="3" w16cid:durableId="1772898440">
     <w:abstractNumId w:val="0"/>
   </w:num>
-  <w:num w:numId="2" w16cid:durableId="1881476108">
+  <w:num w:numId="4" w16cid:durableId="1998220031">
+    <w:abstractNumId w:val="3"/>
+  </w:num>
+  <w:num w:numId="5" w16cid:durableId="1324355664">
     <w:abstractNumId w:val="5"/>
   </w:num>
-  <w:num w:numId="3" w16cid:durableId="1066031807">
+  <w:num w:numId="6" w16cid:durableId="2069760069">
     <w:abstractNumId w:val="4"/>
-  </w:num>
-  <w:num w:numId="4" w16cid:durableId="271517534">
-    <w:abstractNumId w:val="1"/>
-  </w:num>
-  <w:num w:numId="5" w16cid:durableId="424347069">
-    <w:abstractNumId w:val="3"/>
-  </w:num>
-  <w:num w:numId="6" w16cid:durableId="855191655">
-    <w:abstractNumId w:val="2"/>
   </w:num>
 </w:numbering>
 </file>

</xml_diff>

<commit_message>
feat: baseline de permisos del Agente replicable en otra PC
Deja de versionar .gemini/ (config personal del CLI del Agente: permisos,
workspaces de confianza, modelo y rutas de la PC); los archivos siguen en
el disco y la config real del CLI no se toca. Se agrega .gemini/ al
.gitignore.

Se versiona en su lugar la baseline en templates/: antigravity-settings.json
(toolPermission y artifactReviewPolicy en always-proceed,
allowNonWorkspaceAccess, allowlist base de 7 comandos, statusLine y
trustedWorkspaces con placeholders) y los scripts de la barra de estado con
%USERPROFILE%. Paso de instalación por máquina en README, templates/README
y la guía de uso (con el .docx regenerado). Sin model, colorScheme,
workspaces reales ni comandos puntuales.

Spec-ID: agent-cli-permissions-baseline

Co-Authored-By: Claude Sonnet 5 <noreply@anthropic.com>
</commit_message>
<xml_diff>
--- a/docs/modo-de-uso.docx
+++ b/docs/modo-de-uso.docx
@@ -181,7 +181,7 @@
     <w:p>
       <w:pPr>
         <w:pStyle w:val="NormalWeb"/>
-        <w:divId w:val="2146853163"/>
+        <w:divId w:val="694815267"/>
       </w:pPr>
       <w:r>
         <w:rPr>
@@ -450,7 +450,7 @@
         <w:rPr>
           <w:rFonts w:eastAsia="Times New Roman"/>
         </w:rPr>
-        <w:pict w14:anchorId="671DF9DF">
+        <w:pict w14:anchorId="5CE883C8">
           <v:rect id="_x0000_i1025" style="width:0;height:1.5pt" o:hralign="center" o:hrstd="t" o:hr="t" fillcolor="#a0a0a0" stroked="f"/>
         </w:pict>
       </w:r>
@@ -583,6 +583,118 @@
         <w:rPr>
           <w:rStyle w:val="CdigoHTML"/>
         </w:rPr>
+        <w:t># Baseline de permisos y barra de estado del Agente (no sobrescribir un settings.json existente: fusionar a mano)</w:t>
+      </w:r>
+    </w:p>
+    <w:p>
+      <w:pPr>
+        <w:pStyle w:val="HTMLconformatoprevio"/>
+        <w:rPr>
+          <w:rStyle w:val="CdigoHTML"/>
+        </w:rPr>
+      </w:pPr>
+      <w:r>
+        <w:rPr>
+          <w:rStyle w:val="CdigoHTML"/>
+        </w:rPr>
+        <w:t>$ag = "</w:t>
+      </w:r>
+      <w:r>
+        <w:rPr>
+          <w:rStyle w:val="CdigoHTML"/>
+        </w:rPr>
+        <w:t>$env:USERPROFILE\.gemini\antigravity-cli"</w:t>
+      </w:r>
+    </w:p>
+    <w:p>
+      <w:pPr>
+        <w:pStyle w:val="HTMLconformatoprevio"/>
+        <w:rPr>
+          <w:rStyle w:val="CdigoHTML"/>
+        </w:rPr>
+      </w:pPr>
+      <w:r>
+        <w:rPr>
+          <w:rStyle w:val="CdigoHTML"/>
+        </w:rPr>
+        <w:t>New-Item -ItemType Directory -Force "$ag\scratch" | Out-Null</w:t>
+      </w:r>
+    </w:p>
+    <w:p>
+      <w:pPr>
+        <w:pStyle w:val="HTMLconformatoprevio"/>
+        <w:rPr>
+          <w:rStyle w:val="CdigoHTML"/>
+        </w:rPr>
+      </w:pPr>
+      <w:r>
+        <w:rPr>
+          <w:rStyle w:val="CdigoHTML"/>
+        </w:rPr>
+        <w:t>if (-not (Test-Path "$ag\settings.json")) { cp templates\antigravity-settings.json "$ag\settings.json" }</w:t>
+      </w:r>
+    </w:p>
+    <w:p>
+      <w:pPr>
+        <w:pStyle w:val="HTMLconformatoprevio"/>
+        <w:rPr>
+          <w:rStyle w:val="CdigoHTML"/>
+        </w:rPr>
+      </w:pPr>
+      <w:r>
+        <w:rPr>
+          <w:rStyle w:val="CdigoHTML"/>
+        </w:rPr>
+        <w:t>cp templates\antigravity-statusline.bat "$ag\scratch\statusline.bat"</w:t>
+      </w:r>
+    </w:p>
+    <w:p>
+      <w:pPr>
+        <w:pStyle w:val="HTMLconformatoprevio"/>
+        <w:rPr>
+          <w:rStyle w:val="CdigoHTML"/>
+        </w:rPr>
+      </w:pPr>
+      <w:r>
+        <w:rPr>
+          <w:rStyle w:val="CdigoHTML"/>
+        </w:rPr>
+        <w:t>cp templates\antigravity-statusline.ps1 "$ag\scratch\statusline_new.ps1"</w:t>
+      </w:r>
+    </w:p>
+    <w:p>
+      <w:pPr>
+        <w:pStyle w:val="HTMLconformatoprevio"/>
+        <w:rPr>
+          <w:rStyle w:val="CdigoHTML"/>
+        </w:rPr>
+      </w:pPr>
+      <w:r>
+        <w:rPr>
+          <w:rStyle w:val="CdigoHTML"/>
+        </w:rPr>
+        <w:t># Completar en settings.json: {RUTA-DE-TU-USUARIO} y los trustedWorkspaces (ver templates\README.md)</w:t>
+      </w:r>
+    </w:p>
+    <w:p>
+      <w:pPr>
+        <w:pStyle w:val="HTMLconformatoprevio"/>
+        <w:rPr>
+          <w:rStyle w:val="CdigoHTML"/>
+        </w:rPr>
+      </w:pPr>
+    </w:p>
+    <w:p>
+      <w:pPr>
+        <w:pStyle w:val="HTMLconformatoprevio"/>
+        <w:rPr>
+          <w:rStyle w:val="CdigoHTML"/>
+        </w:rPr>
+      </w:pPr>
+      <w:r>
+        <w:rPr>
+          <w:rStyle w:val="CdigoHTML"/>
+        </w:rPr>
         <w:t># Variables de entorno en $PROFILE</w:t>
       </w:r>
     </w:p>
@@ -597,27 +709,27 @@
         <w:rPr>
           <w:rStyle w:val="CdigoHTML"/>
         </w:rPr>
-        <w:t>$env:OBSIDIAN_VAULT  = "C:\TPA"                       # ruta real del vault en esta máquina</w:t>
-      </w:r>
-    </w:p>
-    <w:p>
-      <w:pPr>
-        <w:pStyle w:val="HTMLconformatoprevio"/>
-        <w:rPr>
-          <w:rStyle w:val="CdigoHTML"/>
-        </w:rPr>
-      </w:pPr>
-      <w:r>
-        <w:rPr>
-          <w:rStyle w:val="CdigoHTML"/>
-        </w:rPr>
-        <w:t>$env:SDD_CONFIG_REPO = "</w:t>
-      </w:r>
-      <w:r>
-        <w:rPr>
-          <w:rStyle w:val="CdigoHTML"/>
-        </w:rPr>
-        <w:t>C:\ruta\a\sdd-global-config"  # dónde quedó clonado el repo</w:t>
+        <w:t>$env:OBSIDIAN_VAULT  = "</w:t>
+      </w:r>
+      <w:r>
+        <w:rPr>
+          <w:rStyle w:val="CdigoHTML"/>
+        </w:rPr>
+        <w:t>C:\TPA"                       # ruta real del vault en esta máquina</w:t>
+      </w:r>
+    </w:p>
+    <w:p>
+      <w:pPr>
+        <w:pStyle w:val="HTMLconformatoprevio"/>
+        <w:rPr>
+          <w:rStyle w:val="CdigoHTML"/>
+        </w:rPr>
+      </w:pPr>
+      <w:r>
+        <w:rPr>
+          <w:rStyle w:val="CdigoHTML"/>
+        </w:rPr>
+        <w:t>$env:SDD_CONFIG_REPO = "C:\ruta\a\sdd-global-config"  # dónde quedó clonado el repo</w:t>
       </w:r>
     </w:p>
     <w:p>
@@ -647,7 +759,7 @@
         <w:rPr>
           <w:rFonts w:eastAsia="Times New Roman"/>
         </w:rPr>
-        <w:pict w14:anchorId="0407C206">
+        <w:pict w14:anchorId="5F146958">
           <v:rect id="_x0000_i1026" style="width:0;height:1.5pt" o:hralign="center" o:hrstd="t" o:hr="t" fillcolor="#a0a0a0" stroked="f"/>
         </w:pict>
       </w:r>
@@ -705,27 +817,28 @@
         <w:rPr>
           <w:rStyle w:val="CdigoHTML"/>
         </w:rPr>
-        <w:t>Agente   /openspec-apply-change        → implementa en el branch, commitea con Spec-ID:</w:t>
-      </w:r>
-    </w:p>
-    <w:p>
-      <w:pPr>
-        <w:pStyle w:val="HTMLconformatoprevio"/>
-        <w:rPr>
-          <w:rStyle w:val="CdigoHTML"/>
-        </w:rPr>
-      </w:pPr>
-      <w:r>
-        <w:rPr>
-          <w:rStyle w:val="CdigoHTML"/>
-        </w:rPr>
-        <w:t xml:space="preserve">Claude   </w:t>
-      </w:r>
-      <w:r>
-        <w:rPr>
-          <w:rStyle w:val="CdigoHTML"/>
-        </w:rPr>
-        <w:t>/branch-pr &lt;nombre&gt;           → valida commits, abre PR desde Obsidian decisions/</w:t>
+        <w:t xml:space="preserve">Agente   </w:t>
+      </w:r>
+      <w:r>
+        <w:rPr>
+          <w:rStyle w:val="CdigoHTML"/>
+        </w:rPr>
+        <w:t>/openspec-apply-change        → implementa en el branch, commitea con Spec-ID:</w:t>
+      </w:r>
+    </w:p>
+    <w:p>
+      <w:pPr>
+        <w:pStyle w:val="HTMLconformatoprevio"/>
+        <w:rPr>
+          <w:rStyle w:val="CdigoHTML"/>
+        </w:rPr>
+      </w:pPr>
+      <w:r>
+        <w:rPr>
+          <w:rStyle w:val="CdigoHTML"/>
+        </w:rPr>
+        <w:lastRenderedPageBreak/>
+        <w:t>Claude   /branch-pr &lt;nombre&gt;           → valida commits, abre PR desde Obsidian decisions/</w:t>
       </w:r>
     </w:p>
     <w:p>
@@ -798,7 +911,6 @@
         <w:pStyle w:val="NormalWeb"/>
       </w:pPr>
       <w:r>
-        <w:lastRenderedPageBreak/>
         <w:t xml:space="preserve">Antes de cualquier cambio, creás un issue con el template. Queda en </w:t>
       </w:r>
       <w:r>
@@ -1135,7 +1247,10 @@
         <w:t>decisions/{change}.md</w:t>
       </w:r>
       <w:r>
-        <w:t xml:space="preserve"> del vault para armar el body, valida commits y abre la PR con el formato correcto. El GitHub Action </w:t>
+        <w:t xml:space="preserve"> </w:t>
+      </w:r>
+      <w:r>
+        <w:t xml:space="preserve">del vault para armar el body, valida commits y abre la PR con el formato correcto. El GitHub Action </w:t>
       </w:r>
       <w:r>
         <w:rPr>
@@ -1202,10 +1317,7 @@
         <w:t>git diff</w:t>
       </w:r>
       <w:r>
-        <w:t xml:space="preserve"> </w:t>
-      </w:r>
-      <w:r>
-        <w:t xml:space="preserve">y specs. Confirma que el Agente cumplió la spec. Actualiza </w:t>
+        <w:t xml:space="preserve"> y specs. Confirma que el Agente cumplió la spec. Actualiza </w:t>
       </w:r>
       <w:r>
         <w:rPr>
@@ -1281,7 +1393,7 @@
         <w:rPr>
           <w:rFonts w:eastAsia="Times New Roman"/>
         </w:rPr>
-        <w:pict w14:anchorId="38AB03C5">
+        <w:pict w14:anchorId="2D1A3F12">
           <v:rect id="_x0000_i1027" style="width:0;height:1.5pt" o:hralign="center" o:hrstd="t" o:hr="t" fillcolor="#a0a0a0" stroked="f"/>
         </w:pict>
       </w:r>
@@ -1484,7 +1596,7 @@
         <w:rPr>
           <w:rFonts w:eastAsia="Times New Roman"/>
         </w:rPr>
-        <w:pict w14:anchorId="13BC8120">
+        <w:pict w14:anchorId="62F250CE">
           <v:rect id="_x0000_i1028" style="width:0;height:1.5pt" o:hralign="center" o:hrstd="t" o:hr="t" fillcolor="#a0a0a0" stroked="f"/>
         </w:pict>
       </w:r>
@@ -1873,7 +1985,7 @@
         <w:rPr>
           <w:rFonts w:eastAsia="Times New Roman"/>
         </w:rPr>
-        <w:pict w14:anchorId="41B252F6">
+        <w:pict w14:anchorId="0512E2AE">
           <v:rect id="_x0000_i1029" style="width:0;height:1.5pt" o:hralign="center" o:hrstd="t" o:hr="t" fillcolor="#a0a0a0" stroked="f"/>
         </w:pict>
       </w:r>
@@ -1906,10 +2018,7 @@
         <w:t>$env:OBSIDIAN_VAULT</w:t>
       </w:r>
       <w:r>
-        <w:t xml:space="preserve"> </w:t>
-      </w:r>
-      <w:r>
-        <w:t>actúa como memoria persistente del proyecto — equivalente a Engram pero sobre el filesystem local. Claude lee y escribe automáticamente en cada operación OPSX, sin MCP ni plugins.</w:t>
+        <w:t xml:space="preserve"> actúa como memoria persistente del proyecto — equivalente a Engram pero sobre el filesystem local. Claude lee y escribe automáticamente en cada operación OPSX, sin MCP ni plugins.</w:t>
       </w:r>
     </w:p>
     <w:p>
@@ -2021,13 +2130,13 @@
         <w:rPr>
           <w:rStyle w:val="CdigoHTML"/>
         </w:rPr>
-        <w:t xml:space="preserve">      context.md                    </w:t>
-      </w:r>
-      <w:r>
-        <w:rPr>
-          <w:rStyle w:val="CdigoHTML"/>
-        </w:rPr>
-        <w:t>← estado actual del proyecto (actualizado continuamente)</w:t>
+        <w:t xml:space="preserve">      context.md    </w:t>
+      </w:r>
+      <w:r>
+        <w:rPr>
+          <w:rStyle w:val="CdigoHTML"/>
+        </w:rPr>
+        <w:t xml:space="preserve">                ← estado actual del proyecto (actualizado continuamente)</w:t>
       </w:r>
     </w:p>
     <w:p>
@@ -2987,9 +3096,9 @@
 <file path=word/numbering.xml><?xml version="1.0" encoding="utf-8"?>
 <w:numbering xmlns:wpc="http://schemas.microsoft.com/office/word/2010/wordprocessingCanvas" xmlns:cx="http://schemas.microsoft.com/office/drawing/2014/chartex" xmlns:cx1="http://schemas.microsoft.com/office/drawing/2015/9/8/chartex" xmlns:cx2="http://schemas.microsoft.com/office/drawing/2015/10/21/chartex" xmlns:cx3="http://schemas.microsoft.com/office/drawing/2016/5/9/chartex" xmlns:cx4="http://schemas.microsoft.com/office/drawing/2016/5/10/chartex" xmlns:cx5="http://schemas.microsoft.com/office/drawing/2016/5/11/chartex" xmlns:cx6="http://schemas.microsoft.com/office/drawing/2016/5/12/chartex" xmlns:cx7="http://schemas.microsoft.com/office/drawing/2016/5/13/chartex" xmlns:cx8="http://schemas.microsoft.com/office/drawing/2016/5/14/chartex" xmlns:mc="http://schemas.openxmlformats.org/markup-compatibility/2006" xmlns:aink="http://schemas.microsoft.com/office/drawing/2016/ink" xmlns:am3d="http://schemas.microsoft.com/office/drawing/2017/model3d" xmlns:o="urn:schemas-microsoft-com:office:office" xmlns:oel="http://schemas.microsoft.com/office/2019/extlst" xmlns:r="http://schemas.openxmlformats.org/officeDocument/2006/relationships" xmlns:m="http://schemas.openxmlformats.org/officeDocument/2006/math" xmlns:v="urn:schemas-microsoft-com:vml" xmlns:wp14="http://schemas.microsoft.com/office/word/2010/wordprocessingDrawing" xmlns:wp="http://schemas.openxmlformats.org/drawingml/2006/wordprocessingDrawing" xmlns:w10="urn:schemas-microsoft-com:office:word" xmlns:w="http://schemas.openxmlformats.org/wordprocessingml/2006/main" xmlns:w14="http://schemas.microsoft.com/office/word/2010/wordml" xmlns:w15="http://schemas.microsoft.com/office/word/2012/wordml" xmlns:w16cex="http://schemas.microsoft.com/office/word/2018/wordml/cex" xmlns:w16cid="http://schemas.microsoft.com/office/word/2016/wordml/cid" xmlns:w16="http://schemas.microsoft.com/office/word/2018/wordml" xmlns:w16du="http://schemas.microsoft.com/office/word/2023/wordml/word16du" xmlns:w16sdtdh="http://schemas.microsoft.com/office/word/2020/wordml/sdtdatahash" xmlns:w16sdtfl="http://schemas.microsoft.com/office/word/2024/wordml/sdtformatlock" xmlns:w16se="http://schemas.microsoft.com/office/word/2015/wordml/symex" xmlns:wpg="http://schemas.microsoft.com/office/word/2010/wordprocessingGroup" xmlns:wpi="http://schemas.microsoft.com/office/word/2010/wordprocessingInk" xmlns:wne="http://schemas.microsoft.com/office/word/2006/wordml" xmlns:wps="http://schemas.microsoft.com/office/word/2010/wordprocessingShape" mc:Ignorable="w14 w15 w16se w16cid w16 w16cex w16sdtdh w16sdtfl w16du wp14">
   <w:abstractNum w:abstractNumId="0" w15:restartNumberingAfterBreak="0">
-    <w:nsid w:val="07A911EC"/>
+    <w:nsid w:val="046D079C"/>
     <w:multiLevelType w:val="multilevel"/>
-    <w:tmpl w:val="5D4ED5F6"/>
+    <w:tmpl w:val="3AE8371E"/>
     <w:lvl w:ilvl="0">
       <w:start w:val="1"/>
       <w:numFmt w:val="bullet"/>
@@ -3136,9 +3245,9 @@
     </w:lvl>
   </w:abstractNum>
   <w:abstractNum w:abstractNumId="1" w15:restartNumberingAfterBreak="0">
-    <w:nsid w:val="27355329"/>
+    <w:nsid w:val="0E2422A5"/>
     <w:multiLevelType w:val="multilevel"/>
-    <w:tmpl w:val="12882ACC"/>
+    <w:tmpl w:val="76D89636"/>
     <w:lvl w:ilvl="0">
       <w:start w:val="1"/>
       <w:numFmt w:val="bullet"/>
@@ -3285,9 +3394,9 @@
     </w:lvl>
   </w:abstractNum>
   <w:abstractNum w:abstractNumId="2" w15:restartNumberingAfterBreak="0">
-    <w:nsid w:val="4641642B"/>
+    <w:nsid w:val="66534F97"/>
     <w:multiLevelType w:val="multilevel"/>
-    <w:tmpl w:val="9F0C14FE"/>
+    <w:tmpl w:val="450AF316"/>
     <w:lvl w:ilvl="0">
       <w:start w:val="1"/>
       <w:numFmt w:val="bullet"/>
@@ -3434,9 +3543,9 @@
     </w:lvl>
   </w:abstractNum>
   <w:abstractNum w:abstractNumId="3" w15:restartNumberingAfterBreak="0">
-    <w:nsid w:val="5A6A5F49"/>
+    <w:nsid w:val="6C9C76B9"/>
     <w:multiLevelType w:val="multilevel"/>
-    <w:tmpl w:val="9D0A0D5C"/>
+    <w:tmpl w:val="E13C73B2"/>
     <w:lvl w:ilvl="0">
       <w:start w:val="1"/>
       <w:numFmt w:val="bullet"/>
@@ -3583,9 +3692,9 @@
     </w:lvl>
   </w:abstractNum>
   <w:abstractNum w:abstractNumId="4" w15:restartNumberingAfterBreak="0">
-    <w:nsid w:val="682A6D07"/>
+    <w:nsid w:val="72364AC9"/>
     <w:multiLevelType w:val="multilevel"/>
-    <w:tmpl w:val="CE2CFE3C"/>
+    <w:tmpl w:val="AD8419F4"/>
     <w:lvl w:ilvl="0">
       <w:start w:val="1"/>
       <w:numFmt w:val="bullet"/>
@@ -3732,9 +3841,9 @@
     </w:lvl>
   </w:abstractNum>
   <w:abstractNum w:abstractNumId="5" w15:restartNumberingAfterBreak="0">
-    <w:nsid w:val="7B75148F"/>
+    <w:nsid w:val="78F117FE"/>
     <w:multiLevelType w:val="multilevel"/>
-    <w:tmpl w:val="D63C4774"/>
+    <w:tmpl w:val="41B4FCC2"/>
     <w:lvl w:ilvl="0">
       <w:start w:val="1"/>
       <w:numFmt w:val="bullet"/>
@@ -3880,23 +3989,23 @@
       </w:rPr>
     </w:lvl>
   </w:abstractNum>
-  <w:num w:numId="1" w16cid:durableId="1618488193">
+  <w:num w:numId="1" w16cid:durableId="303197745">
     <w:abstractNumId w:val="2"/>
   </w:num>
-  <w:num w:numId="2" w16cid:durableId="767190259">
+  <w:num w:numId="2" w16cid:durableId="88505108">
     <w:abstractNumId w:val="1"/>
   </w:num>
-  <w:num w:numId="3" w16cid:durableId="1772898440">
+  <w:num w:numId="3" w16cid:durableId="467747012">
+    <w:abstractNumId w:val="5"/>
+  </w:num>
+  <w:num w:numId="4" w16cid:durableId="2006935355">
+    <w:abstractNumId w:val="4"/>
+  </w:num>
+  <w:num w:numId="5" w16cid:durableId="2013528167">
     <w:abstractNumId w:val="0"/>
   </w:num>
-  <w:num w:numId="4" w16cid:durableId="1998220031">
+  <w:num w:numId="6" w16cid:durableId="4794914">
     <w:abstractNumId w:val="3"/>
-  </w:num>
-  <w:num w:numId="5" w16cid:durableId="1324355664">
-    <w:abstractNumId w:val="5"/>
-  </w:num>
-  <w:num w:numId="6" w16cid:durableId="2069760069">
-    <w:abstractNumId w:val="4"/>
   </w:num>
 </w:numbering>
 </file>

</xml_diff>

<commit_message>
refactor: la barra de estado se especifica por comportamiento
Los scripts de la barra de estado los genera el propio CLI del Agente, así
que no se versionan. La spec agent-cli-permissions describe su
comportamiento (entrada, campos, formato de salida y escenarios) y
templates/README.md documenta el prompt para que el CLI la genere en cada
máquina. Se quitan templates/antigravity-statusline.bat y .ps1 y los pasos
de copiado del README y la guía (con el .docx regenerado).

El comportamiento de la spec se verificó contra el script vigente del CLI
con las entradas de ejemplo de los escenarios.

Spec-ID: agent-cli-permissions-baseline

Co-Authored-By: Claude Sonnet 5 <noreply@anthropic.com>
</commit_message>
<xml_diff>
--- a/docs/modo-de-uso.docx
+++ b/docs/modo-de-uso.docx
@@ -181,7 +181,7 @@
     <w:p>
       <w:pPr>
         <w:pStyle w:val="NormalWeb"/>
-        <w:divId w:val="694815267"/>
+        <w:divId w:val="1554849974"/>
       </w:pPr>
       <w:r>
         <w:rPr>
@@ -450,7 +450,7 @@
         <w:rPr>
           <w:rFonts w:eastAsia="Times New Roman"/>
         </w:rPr>
-        <w:pict w14:anchorId="5CE883C8">
+        <w:pict w14:anchorId="74DDE0F4">
           <v:rect id="_x0000_i1025" style="width:0;height:1.5pt" o:hralign="center" o:hrstd="t" o:hr="t" fillcolor="#a0a0a0" stroked="f"/>
         </w:pict>
       </w:r>
@@ -583,41 +583,35 @@
         <w:rPr>
           <w:rStyle w:val="CdigoHTML"/>
         </w:rPr>
-        <w:t># Baseline de permisos y barra de estado del Agente (no sobrescribir un settings.json existente: fusionar a mano)</w:t>
-      </w:r>
-    </w:p>
-    <w:p>
-      <w:pPr>
-        <w:pStyle w:val="HTMLconformatoprevio"/>
-        <w:rPr>
-          <w:rStyle w:val="CdigoHTML"/>
-        </w:rPr>
-      </w:pPr>
-      <w:r>
-        <w:rPr>
-          <w:rStyle w:val="CdigoHTML"/>
-        </w:rPr>
-        <w:t>$ag = "</w:t>
-      </w:r>
-      <w:r>
-        <w:rPr>
-          <w:rStyle w:val="CdigoHTML"/>
-        </w:rPr>
-        <w:t>$env:USERPROFILE\.gemini\antigravity-cli"</w:t>
-      </w:r>
-    </w:p>
-    <w:p>
-      <w:pPr>
-        <w:pStyle w:val="HTMLconformatoprevio"/>
-        <w:rPr>
-          <w:rStyle w:val="CdigoHTML"/>
-        </w:rPr>
-      </w:pPr>
-      <w:r>
-        <w:rPr>
-          <w:rStyle w:val="CdigoHTML"/>
-        </w:rPr>
-        <w:t>New-Item -ItemType Directory -Force "$ag\scratch" | Out-Null</w:t>
+        <w:t># Baseline de permisos del Agente (no sobrescribir un settings.json existente: fusionar a mano)</w:t>
+      </w:r>
+    </w:p>
+    <w:p>
+      <w:pPr>
+        <w:pStyle w:val="HTMLconformatoprevio"/>
+        <w:rPr>
+          <w:rStyle w:val="CdigoHTML"/>
+        </w:rPr>
+      </w:pPr>
+      <w:r>
+        <w:rPr>
+          <w:rStyle w:val="CdigoHTML"/>
+        </w:rPr>
+        <w:t>$ag = "$env:USERPROFILE\.gemini\antigravity-cli"</w:t>
+      </w:r>
+    </w:p>
+    <w:p>
+      <w:pPr>
+        <w:pStyle w:val="HTMLconformatoprevio"/>
+        <w:rPr>
+          <w:rStyle w:val="CdigoHTML"/>
+        </w:rPr>
+      </w:pPr>
+      <w:r>
+        <w:rPr>
+          <w:rStyle w:val="CdigoHTML"/>
+        </w:rPr>
+        <w:t>New-Item -ItemType Directory -Force $ag | Out-Null</w:t>
       </w:r>
     </w:p>
     <w:p>
@@ -645,34 +639,6 @@
         <w:rPr>
           <w:rStyle w:val="CdigoHTML"/>
         </w:rPr>
-        <w:t>cp templates\antigravity-statusline.bat "$ag\scratch\statusline.bat"</w:t>
-      </w:r>
-    </w:p>
-    <w:p>
-      <w:pPr>
-        <w:pStyle w:val="HTMLconformatoprevio"/>
-        <w:rPr>
-          <w:rStyle w:val="CdigoHTML"/>
-        </w:rPr>
-      </w:pPr>
-      <w:r>
-        <w:rPr>
-          <w:rStyle w:val="CdigoHTML"/>
-        </w:rPr>
-        <w:t>cp templates\antigravity-statusline.ps1 "$ag\scratch\statusline_new.ps1"</w:t>
-      </w:r>
-    </w:p>
-    <w:p>
-      <w:pPr>
-        <w:pStyle w:val="HTMLconformatoprevio"/>
-        <w:rPr>
-          <w:rStyle w:val="CdigoHTML"/>
-        </w:rPr>
-      </w:pPr>
-      <w:r>
-        <w:rPr>
-          <w:rStyle w:val="CdigoHTML"/>
-        </w:rPr>
         <w:t># Completar en settings.json: {RUTA-DE-TU-USUARIO} y los trustedWorkspaces (ver templates\README.md)</w:t>
       </w:r>
     </w:p>
@@ -683,6 +649,20 @@
           <w:rStyle w:val="CdigoHTML"/>
         </w:rPr>
       </w:pPr>
+      <w:r>
+        <w:rPr>
+          <w:rStyle w:val="CdigoHTML"/>
+        </w:rPr>
+        <w:t># La barra de estado no se copia: se genera con el CLI del Agente (prompt en templates\README.md, sección "Barra de estado")</w:t>
+      </w:r>
+    </w:p>
+    <w:p>
+      <w:pPr>
+        <w:pStyle w:val="HTMLconformatoprevio"/>
+        <w:rPr>
+          <w:rStyle w:val="CdigoHTML"/>
+        </w:rPr>
+      </w:pPr>
     </w:p>
     <w:p>
       <w:pPr>
@@ -709,13 +689,7 @@
         <w:rPr>
           <w:rStyle w:val="CdigoHTML"/>
         </w:rPr>
-        <w:t>$env:OBSIDIAN_VAULT  = "</w:t>
-      </w:r>
-      <w:r>
-        <w:rPr>
-          <w:rStyle w:val="CdigoHTML"/>
-        </w:rPr>
-        <w:t>C:\TPA"                       # ruta real del vault en esta máquina</w:t>
+        <w:t>$env:OBSIDIAN_VAULT  = "C:\TPA"                       # ruta real del vault en esta máquina</w:t>
       </w:r>
     </w:p>
     <w:p>
@@ -759,7 +733,7 @@
         <w:rPr>
           <w:rFonts w:eastAsia="Times New Roman"/>
         </w:rPr>
-        <w:pict w14:anchorId="5F146958">
+        <w:pict w14:anchorId="7F0BE513">
           <v:rect id="_x0000_i1026" style="width:0;height:1.5pt" o:hralign="center" o:hrstd="t" o:hr="t" fillcolor="#a0a0a0" stroked="f"/>
         </w:pict>
       </w:r>
@@ -817,13 +791,13 @@
         <w:rPr>
           <w:rStyle w:val="CdigoHTML"/>
         </w:rPr>
-        <w:t xml:space="preserve">Agente   </w:t>
-      </w:r>
-      <w:r>
-        <w:rPr>
-          <w:rStyle w:val="CdigoHTML"/>
-        </w:rPr>
-        <w:t>/openspec-apply-change        → implementa en el branch, commitea con Spec-ID:</w:t>
+        <w:t xml:space="preserve">Agente   /openspec-apply-change        </w:t>
+      </w:r>
+      <w:r>
+        <w:rPr>
+          <w:rStyle w:val="CdigoHTML"/>
+        </w:rPr>
+        <w:t>→ implementa en el branch, commitea con Spec-ID:</w:t>
       </w:r>
     </w:p>
     <w:p>
@@ -1106,7 +1080,10 @@
         <w:t>context.md</w:t>
       </w:r>
       <w:r>
-        <w:t xml:space="preserve"> y crea el branch </w:t>
+        <w:t xml:space="preserve"> </w:t>
+      </w:r>
+      <w:r>
+        <w:t xml:space="preserve">y crea el branch </w:t>
       </w:r>
       <w:r>
         <w:rPr>
@@ -1247,10 +1224,7 @@
         <w:t>decisions/{change}.md</w:t>
       </w:r>
       <w:r>
-        <w:t xml:space="preserve"> </w:t>
-      </w:r>
-      <w:r>
-        <w:t xml:space="preserve">del vault para armar el body, valida commits y abre la PR con el formato correcto. El GitHub Action </w:t>
+        <w:t xml:space="preserve"> del vault para armar el body, valida commits y abre la PR con el formato correcto. El GitHub Action </w:t>
       </w:r>
       <w:r>
         <w:rPr>
@@ -1393,7 +1367,7 @@
         <w:rPr>
           <w:rFonts w:eastAsia="Times New Roman"/>
         </w:rPr>
-        <w:pict w14:anchorId="2D1A3F12">
+        <w:pict w14:anchorId="06601499">
           <v:rect id="_x0000_i1027" style="width:0;height:1.5pt" o:hralign="center" o:hrstd="t" o:hr="t" fillcolor="#a0a0a0" stroked="f"/>
         </w:pict>
       </w:r>
@@ -1571,7 +1545,19 @@
         <w:rPr>
           <w:rFonts w:eastAsia="Times New Roman"/>
         </w:rPr>
-        <w:t xml:space="preserve"> → </w:t>
+        <w:t xml:space="preserve"> </w:t>
+      </w:r>
+      <w:r>
+        <w:rPr>
+          <w:rFonts w:eastAsia="Times New Roman"/>
+        </w:rPr>
+        <w:t>→</w:t>
+      </w:r>
+      <w:r>
+        <w:rPr>
+          <w:rFonts w:eastAsia="Times New Roman"/>
+        </w:rPr>
+        <w:t xml:space="preserve"> </w:t>
       </w:r>
       <w:r>
         <w:rPr>
@@ -1596,7 +1582,7 @@
         <w:rPr>
           <w:rFonts w:eastAsia="Times New Roman"/>
         </w:rPr>
-        <w:pict w14:anchorId="62F250CE">
+        <w:pict w14:anchorId="2F02ED73">
           <v:rect id="_x0000_i1028" style="width:0;height:1.5pt" o:hralign="center" o:hrstd="t" o:hr="t" fillcolor="#a0a0a0" stroked="f"/>
         </w:pict>
       </w:r>
@@ -1730,7 +1716,13 @@
         <w:rPr>
           <w:rFonts w:eastAsia="Times New Roman"/>
         </w:rPr>
-        <w:t xml:space="preserve"> — types: </w:t>
+        <w:t xml:space="preserve"> </w:t>
+      </w:r>
+      <w:r>
+        <w:rPr>
+          <w:rFonts w:eastAsia="Times New Roman"/>
+        </w:rPr>
+        <w:t xml:space="preserve">— types: </w:t>
       </w:r>
       <w:r>
         <w:rPr>
@@ -1985,7 +1977,7 @@
         <w:rPr>
           <w:rFonts w:eastAsia="Times New Roman"/>
         </w:rPr>
-        <w:pict w14:anchorId="0512E2AE">
+        <w:pict w14:anchorId="1E5C33A4">
           <v:rect id="_x0000_i1029" style="width:0;height:1.5pt" o:hralign="center" o:hrstd="t" o:hr="t" fillcolor="#a0a0a0" stroked="f"/>
         </w:pict>
       </w:r>
@@ -2018,7 +2010,10 @@
         <w:t>$env:OBSIDIAN_VAULT</w:t>
       </w:r>
       <w:r>
-        <w:t xml:space="preserve"> actúa como memoria persistente del proyecto — equivalente a Engram pero sobre el filesystem local. Claude lee y escribe automáticamente en cada operación OPSX, sin MCP ni plugins.</w:t>
+        <w:t xml:space="preserve"> </w:t>
+      </w:r>
+      <w:r>
+        <w:t>actúa como memoria persistente del proyecto — equivalente a Engram pero sobre el filesystem local. Claude lee y escribe automáticamente en cada operación OPSX, sin MCP ni plugins.</w:t>
       </w:r>
     </w:p>
     <w:p>
@@ -2074,7 +2069,13 @@
         <w:rPr>
           <w:rStyle w:val="CdigoHTML"/>
         </w:rPr>
-        <w:t xml:space="preserve">    reglas-globales.md              ← espejo del CLAUDE.md global (lo lee el Agente)</w:t>
+        <w:t xml:space="preserve">    reglas-globales.md              </w:t>
+      </w:r>
+      <w:r>
+        <w:rPr>
+          <w:rStyle w:val="CdigoHTML"/>
+        </w:rPr>
+        <w:t>← espejo del CLAUDE.md global (lo lee el Agente)</w:t>
       </w:r>
     </w:p>
     <w:p>
@@ -2116,27 +2117,33 @@
         <w:rPr>
           <w:rStyle w:val="CdigoHTML"/>
         </w:rPr>
-        <w:t xml:space="preserve">      _index.md                     ← índice con links a todos los changes</w:t>
-      </w:r>
-    </w:p>
-    <w:p>
-      <w:pPr>
-        <w:pStyle w:val="HTMLconformatoprevio"/>
-        <w:rPr>
-          <w:rStyle w:val="CdigoHTML"/>
-        </w:rPr>
-      </w:pPr>
-      <w:r>
-        <w:rPr>
-          <w:rStyle w:val="CdigoHTML"/>
-        </w:rPr>
-        <w:t xml:space="preserve">      context.md    </w:t>
-      </w:r>
-      <w:r>
-        <w:rPr>
-          <w:rStyle w:val="CdigoHTML"/>
-        </w:rPr>
-        <w:t xml:space="preserve">                ← estado actual del proyecto (actualizado continuamente)</w:t>
+        <w:t xml:space="preserve">      _index.md                     </w:t>
+      </w:r>
+      <w:r>
+        <w:rPr>
+          <w:rStyle w:val="CdigoHTML"/>
+        </w:rPr>
+        <w:t>← índice con links a todos los changes</w:t>
+      </w:r>
+    </w:p>
+    <w:p>
+      <w:pPr>
+        <w:pStyle w:val="HTMLconformatoprevio"/>
+        <w:rPr>
+          <w:rStyle w:val="CdigoHTML"/>
+        </w:rPr>
+      </w:pPr>
+      <w:r>
+        <w:rPr>
+          <w:rStyle w:val="CdigoHTML"/>
+        </w:rPr>
+        <w:t xml:space="preserve">      context.md                    </w:t>
+      </w:r>
+      <w:r>
+        <w:rPr>
+          <w:rStyle w:val="CdigoHTML"/>
+        </w:rPr>
+        <w:t>← estado actual del proyecto (actualizado continuamente)</w:t>
       </w:r>
     </w:p>
     <w:p>
@@ -2164,7 +2171,13 @@
         <w:rPr>
           <w:rStyle w:val="CdigoHTML"/>
         </w:rPr>
-        <w:t xml:space="preserve">        YYYY-MM-DD-{change}.md      ← creada al propose</w:t>
+        <w:t xml:space="preserve">        YYYY-MM-DD-{change}.md      </w:t>
+      </w:r>
+      <w:r>
+        <w:rPr>
+          <w:rStyle w:val="CdigoHTML"/>
+        </w:rPr>
+        <w:t>← creada al propose</w:t>
       </w:r>
     </w:p>
     <w:p>
@@ -2192,7 +2205,13 @@
         <w:rPr>
           <w:rStyle w:val="CdigoHTML"/>
         </w:rPr>
-        <w:t xml:space="preserve">        YYYY-MM-DD-{change}.md      ← creada al archive</w:t>
+        <w:t xml:space="preserve">        YYYY-MM-DD-{change}.md      </w:t>
+      </w:r>
+      <w:r>
+        <w:rPr>
+          <w:rStyle w:val="CdigoHTML"/>
+        </w:rPr>
+        <w:t>← creada al archive</w:t>
       </w:r>
     </w:p>
     <w:p>
@@ -3096,9 +3115,9 @@
 <file path=word/numbering.xml><?xml version="1.0" encoding="utf-8"?>
 <w:numbering xmlns:wpc="http://schemas.microsoft.com/office/word/2010/wordprocessingCanvas" xmlns:cx="http://schemas.microsoft.com/office/drawing/2014/chartex" xmlns:cx1="http://schemas.microsoft.com/office/drawing/2015/9/8/chartex" xmlns:cx2="http://schemas.microsoft.com/office/drawing/2015/10/21/chartex" xmlns:cx3="http://schemas.microsoft.com/office/drawing/2016/5/9/chartex" xmlns:cx4="http://schemas.microsoft.com/office/drawing/2016/5/10/chartex" xmlns:cx5="http://schemas.microsoft.com/office/drawing/2016/5/11/chartex" xmlns:cx6="http://schemas.microsoft.com/office/drawing/2016/5/12/chartex" xmlns:cx7="http://schemas.microsoft.com/office/drawing/2016/5/13/chartex" xmlns:cx8="http://schemas.microsoft.com/office/drawing/2016/5/14/chartex" xmlns:mc="http://schemas.openxmlformats.org/markup-compatibility/2006" xmlns:aink="http://schemas.microsoft.com/office/drawing/2016/ink" xmlns:am3d="http://schemas.microsoft.com/office/drawing/2017/model3d" xmlns:o="urn:schemas-microsoft-com:office:office" xmlns:oel="http://schemas.microsoft.com/office/2019/extlst" xmlns:r="http://schemas.openxmlformats.org/officeDocument/2006/relationships" xmlns:m="http://schemas.openxmlformats.org/officeDocument/2006/math" xmlns:v="urn:schemas-microsoft-com:vml" xmlns:wp14="http://schemas.microsoft.com/office/word/2010/wordprocessingDrawing" xmlns:wp="http://schemas.openxmlformats.org/drawingml/2006/wordprocessingDrawing" xmlns:w10="urn:schemas-microsoft-com:office:word" xmlns:w="http://schemas.openxmlformats.org/wordprocessingml/2006/main" xmlns:w14="http://schemas.microsoft.com/office/word/2010/wordml" xmlns:w15="http://schemas.microsoft.com/office/word/2012/wordml" xmlns:w16cex="http://schemas.microsoft.com/office/word/2018/wordml/cex" xmlns:w16cid="http://schemas.microsoft.com/office/word/2016/wordml/cid" xmlns:w16="http://schemas.microsoft.com/office/word/2018/wordml" xmlns:w16du="http://schemas.microsoft.com/office/word/2023/wordml/word16du" xmlns:w16sdtdh="http://schemas.microsoft.com/office/word/2020/wordml/sdtdatahash" xmlns:w16sdtfl="http://schemas.microsoft.com/office/word/2024/wordml/sdtformatlock" xmlns:w16se="http://schemas.microsoft.com/office/word/2015/wordml/symex" xmlns:wpg="http://schemas.microsoft.com/office/word/2010/wordprocessingGroup" xmlns:wpi="http://schemas.microsoft.com/office/word/2010/wordprocessingInk" xmlns:wne="http://schemas.microsoft.com/office/word/2006/wordml" xmlns:wps="http://schemas.microsoft.com/office/word/2010/wordprocessingShape" mc:Ignorable="w14 w15 w16se w16cid w16 w16cex w16sdtdh w16sdtfl w16du wp14">
   <w:abstractNum w:abstractNumId="0" w15:restartNumberingAfterBreak="0">
-    <w:nsid w:val="046D079C"/>
+    <w:nsid w:val="1AD3441B"/>
     <w:multiLevelType w:val="multilevel"/>
-    <w:tmpl w:val="3AE8371E"/>
+    <w:tmpl w:val="E08AB5E8"/>
     <w:lvl w:ilvl="0">
       <w:start w:val="1"/>
       <w:numFmt w:val="bullet"/>
@@ -3245,9 +3264,9 @@
     </w:lvl>
   </w:abstractNum>
   <w:abstractNum w:abstractNumId="1" w15:restartNumberingAfterBreak="0">
-    <w:nsid w:val="0E2422A5"/>
+    <w:nsid w:val="1CDC542E"/>
     <w:multiLevelType w:val="multilevel"/>
-    <w:tmpl w:val="76D89636"/>
+    <w:tmpl w:val="684498E6"/>
     <w:lvl w:ilvl="0">
       <w:start w:val="1"/>
       <w:numFmt w:val="bullet"/>
@@ -3394,9 +3413,9 @@
     </w:lvl>
   </w:abstractNum>
   <w:abstractNum w:abstractNumId="2" w15:restartNumberingAfterBreak="0">
-    <w:nsid w:val="66534F97"/>
+    <w:nsid w:val="20DC4203"/>
     <w:multiLevelType w:val="multilevel"/>
-    <w:tmpl w:val="450AF316"/>
+    <w:tmpl w:val="5BE4D5F4"/>
     <w:lvl w:ilvl="0">
       <w:start w:val="1"/>
       <w:numFmt w:val="bullet"/>
@@ -3543,9 +3562,9 @@
     </w:lvl>
   </w:abstractNum>
   <w:abstractNum w:abstractNumId="3" w15:restartNumberingAfterBreak="0">
-    <w:nsid w:val="6C9C76B9"/>
+    <w:nsid w:val="460B4EDB"/>
     <w:multiLevelType w:val="multilevel"/>
-    <w:tmpl w:val="E13C73B2"/>
+    <w:tmpl w:val="F3D4CFA2"/>
     <w:lvl w:ilvl="0">
       <w:start w:val="1"/>
       <w:numFmt w:val="bullet"/>
@@ -3692,9 +3711,9 @@
     </w:lvl>
   </w:abstractNum>
   <w:abstractNum w:abstractNumId="4" w15:restartNumberingAfterBreak="0">
-    <w:nsid w:val="72364AC9"/>
+    <w:nsid w:val="5F5C17C4"/>
     <w:multiLevelType w:val="multilevel"/>
-    <w:tmpl w:val="AD8419F4"/>
+    <w:tmpl w:val="FECA3D22"/>
     <w:lvl w:ilvl="0">
       <w:start w:val="1"/>
       <w:numFmt w:val="bullet"/>
@@ -3841,9 +3860,9 @@
     </w:lvl>
   </w:abstractNum>
   <w:abstractNum w:abstractNumId="5" w15:restartNumberingAfterBreak="0">
-    <w:nsid w:val="78F117FE"/>
+    <w:nsid w:val="78D02190"/>
     <w:multiLevelType w:val="multilevel"/>
-    <w:tmpl w:val="41B4FCC2"/>
+    <w:tmpl w:val="A5D8E552"/>
     <w:lvl w:ilvl="0">
       <w:start w:val="1"/>
       <w:numFmt w:val="bullet"/>
@@ -3989,23 +4008,23 @@
       </w:rPr>
     </w:lvl>
   </w:abstractNum>
-  <w:num w:numId="1" w16cid:durableId="303197745">
+  <w:num w:numId="1" w16cid:durableId="277489951">
+    <w:abstractNumId w:val="5"/>
+  </w:num>
+  <w:num w:numId="2" w16cid:durableId="2063288308">
+    <w:abstractNumId w:val="3"/>
+  </w:num>
+  <w:num w:numId="3" w16cid:durableId="148637443">
+    <w:abstractNumId w:val="0"/>
+  </w:num>
+  <w:num w:numId="4" w16cid:durableId="246381717">
+    <w:abstractNumId w:val="1"/>
+  </w:num>
+  <w:num w:numId="5" w16cid:durableId="1144274190">
     <w:abstractNumId w:val="2"/>
   </w:num>
-  <w:num w:numId="2" w16cid:durableId="88505108">
-    <w:abstractNumId w:val="1"/>
-  </w:num>
-  <w:num w:numId="3" w16cid:durableId="467747012">
-    <w:abstractNumId w:val="5"/>
-  </w:num>
-  <w:num w:numId="4" w16cid:durableId="2006935355">
+  <w:num w:numId="6" w16cid:durableId="1191141975">
     <w:abstractNumId w:val="4"/>
-  </w:num>
-  <w:num w:numId="5" w16cid:durableId="2013528167">
-    <w:abstractNumId w:val="0"/>
-  </w:num>
-  <w:num w:numId="6" w16cid:durableId="4794914">
-    <w:abstractNumId w:val="3"/>
   </w:num>
 </w:numbering>
 </file>

</xml_diff>

<commit_message>
docs: iniciar proyectos con --tools <agente> y setup con comandos globales
Las guías (README, docs/workflow.md y docs/modo-de-uso.md, con el .docx
regenerado) inician los proyectos con openspec init --tools <agente>, sin
claude: con claude, init genera copias locales por defecto de los comandos
/opsx y de las skills openspec-* que pisan a las globales de ~/.claude. Se
elimina el paso de "liberar el slot de apply".

El setup por máquina ahora copia todas las skills de skills/ (incluida
openspec-explore) y los comandos de .claude/commands/opsx/, que antes no se
instalaban. Nueva sección para limpiar copias locales en proyectos
existentes: commit aparte, desde la rama principal, sin tocar el resto de
.claude/. Verificado en carpetas temporales: solo con el Agente no se crea
.claude/ y openspec update no recrea las copias eliminadas.

Spec-ID: onboarding-agent-only-init

Co-Authored-By: Claude Sonnet 5 <noreply@anthropic.com>
</commit_message>
<xml_diff>
--- a/docs/modo-de-uso.docx
+++ b/docs/modo-de-uso.docx
@@ -49,7 +49,7 @@
         <w:rPr>
           <w:rFonts w:eastAsia="Times New Roman"/>
         </w:rPr>
-        <w:t>Paso 1 — Init</w:t>
+        <w:t>Paso 1 — Init (solo con el Agente)</w:t>
       </w:r>
     </w:p>
     <w:p>
@@ -77,7 +77,7 @@
         <w:rPr>
           <w:rStyle w:val="CdigoHTML"/>
         </w:rPr>
-        <w:t>openspec init --tools claude,&lt;agente&gt;</w:t>
+        <w:t>openspec init --tools &lt;agente&gt;</w:t>
       </w:r>
     </w:p>
     <w:p>
@@ -126,6 +126,105 @@
     </w:p>
     <w:p>
       <w:pPr>
+        <w:pStyle w:val="NormalWeb"/>
+      </w:pPr>
+      <w:r>
+        <w:rPr>
+          <w:rStyle w:val="Fuerte"/>
+        </w:rPr>
+        <w:t xml:space="preserve">No incluir </w:t>
+      </w:r>
+      <w:r>
+        <w:rPr>
+          <w:rStyle w:val="CdigoHTML"/>
+          <w:b/>
+          <w:bCs/>
+        </w:rPr>
+        <w:t>claude</w:t>
+      </w:r>
+      <w:r>
+        <w:rPr>
+          <w:rStyle w:val="Fuerte"/>
+        </w:rPr>
+        <w:t xml:space="preserve"> en </w:t>
+      </w:r>
+      <w:r>
+        <w:rPr>
+          <w:rStyle w:val="CdigoHTML"/>
+          <w:b/>
+          <w:bCs/>
+        </w:rPr>
+        <w:t>--tools</w:t>
+      </w:r>
+      <w:r>
+        <w:rPr>
+          <w:rStyle w:val="Fuerte"/>
+        </w:rPr>
+        <w:t>.</w:t>
+      </w:r>
+      <w:r>
+        <w:t xml:space="preserve"> Con </w:t>
+      </w:r>
+      <w:r>
+        <w:rPr>
+          <w:rStyle w:val="CdigoHTML"/>
+        </w:rPr>
+        <w:t>claude</w:t>
+      </w:r>
+      <w:r>
+        <w:t xml:space="preserve">, </w:t>
+      </w:r>
+      <w:r>
+        <w:rPr>
+          <w:rStyle w:val="CdigoHTML"/>
+        </w:rPr>
+        <w:t>openspec init</w:t>
+      </w:r>
+      <w:r>
+        <w:t xml:space="preserve"> genera en el proyecto copias por defecto de los comandos </w:t>
+      </w:r>
+      <w:r>
+        <w:rPr>
+          <w:rStyle w:val="CdigoHTML"/>
+        </w:rPr>
+        <w:t>/opsx</w:t>
+      </w:r>
+      <w:r>
+        <w:t xml:space="preserve"> y de las skills </w:t>
+      </w:r>
+      <w:r>
+        <w:rPr>
+          <w:rStyle w:val="CdigoHTML"/>
+        </w:rPr>
+        <w:t>openspec-*</w:t>
+      </w:r>
+      <w:r>
+        <w:t xml:space="preserve"> </w:t>
+      </w:r>
+      <w:r>
+        <w:t xml:space="preserve">(donde Claude escribe código y no usa el vault) que pisan a las globales de </w:t>
+      </w:r>
+      <w:r>
+        <w:rPr>
+          <w:rStyle w:val="CdigoHTML"/>
+        </w:rPr>
+        <w:t>~/.claude</w:t>
+      </w:r>
+      <w:r>
+        <w:t xml:space="preserve">. Sin </w:t>
+      </w:r>
+      <w:r>
+        <w:rPr>
+          <w:rStyle w:val="CdigoHTML"/>
+        </w:rPr>
+        <w:t>claude</w:t>
+      </w:r>
+      <w:r>
+        <w:t>, Claude usa las globales, que anuncian el handoff al Agente en vez de escribir código.</w:t>
+      </w:r>
+    </w:p>
+    <w:p>
+      <w:pPr>
         <w:pStyle w:val="Ttulo3"/>
         <w:rPr>
           <w:rFonts w:eastAsia="Times New Roman"/>
@@ -135,7 +234,7 @@
         <w:rPr>
           <w:rFonts w:eastAsia="Times New Roman"/>
         </w:rPr>
-        <w:t>Paso 2 — Liberar el slot de apply</w:t>
+        <w:t>Paso 2 — Completar openspec/config.yaml</w:t>
       </w:r>
     </w:p>
     <w:p>
@@ -143,63 +242,146 @@
         <w:pStyle w:val="NormalWeb"/>
       </w:pPr>
       <w:r>
-        <w:rPr>
-          <w:rStyle w:val="CdigoHTML"/>
-        </w:rPr>
-        <w:t>openspec init</w:t>
-      </w:r>
-      <w:r>
-        <w:t xml:space="preserve"> crea </w:t>
-      </w:r>
-      <w:r>
-        <w:rPr>
-          <w:rStyle w:val="CdigoHTML"/>
-        </w:rPr>
-        <w:t>.claude\skills\openspec-apply-change\SKILL.md</w:t>
+        <w:t>Decile a Claude qué hace el proyecto (frontend, backend, fullstack, qué stack usa) y te arma el config completo.</w:t>
+      </w:r>
+    </w:p>
+    <w:p>
+      <w:pPr>
+        <w:pStyle w:val="Ttulo3"/>
+        <w:rPr>
+          <w:rFonts w:eastAsia="Times New Roman"/>
+        </w:rPr>
+      </w:pPr>
+      <w:r>
+        <w:rPr>
+          <w:rFonts w:eastAsia="Times New Roman"/>
+        </w:rPr>
+        <w:t xml:space="preserve">Paso 3 — Verificar que </w:t>
+      </w:r>
+      <w:r>
+        <w:rPr>
+          <w:rStyle w:val="CdigoHTML"/>
+        </w:rPr>
+        <w:t>.agent\skills\openspec-apply-change\SKILL.md</w:t>
+      </w:r>
+      <w:r>
+        <w:rPr>
+          <w:rFonts w:eastAsia="Times New Roman"/>
+        </w:rPr>
+        <w:t xml:space="preserve"> existe</w:t>
+      </w:r>
+    </w:p>
+    <w:p>
+      <w:pPr>
+        <w:pStyle w:val="HTMLconformatoprevio"/>
+        <w:rPr>
+          <w:rStyle w:val="CdigoHTML"/>
+        </w:rPr>
+      </w:pPr>
+      <w:r>
+        <w:rPr>
+          <w:rStyle w:val="CdigoHTML"/>
+        </w:rPr>
+        <w:t>ls .agent\skills\openspec-apply-change\</w:t>
+      </w:r>
+    </w:p>
+    <w:p>
+      <w:pPr>
+        <w:pStyle w:val="NormalWeb"/>
+      </w:pPr>
+      <w:r>
+        <w:t xml:space="preserve">Debe mostrar </w:t>
+      </w:r>
+      <w:r>
+        <w:rPr>
+          <w:rStyle w:val="CdigoHTML"/>
+        </w:rPr>
+        <w:t>SKILL.md</w:t>
       </w:r>
       <w:r>
         <w:t xml:space="preserve"> </w:t>
       </w:r>
       <w:r>
-        <w:t>con el comportamiento default donde Claude escribe código. Al borrarlo, el directorio queda vacío y Claude Code cae al skill global modificado — el que anuncia handoff al Agente en vez de escribir código.</w:t>
-      </w:r>
-    </w:p>
-    <w:p>
-      <w:pPr>
-        <w:pStyle w:val="HTMLconformatoprevio"/>
-        <w:rPr>
-          <w:rStyle w:val="CdigoHTML"/>
-        </w:rPr>
-      </w:pPr>
-      <w:r>
-        <w:rPr>
-          <w:rStyle w:val="CdigoHTML"/>
-        </w:rPr>
-        <w:t>rm .claude\skills\openspec-apply-change\SKILL.md</w:t>
+        <w:t>— ese es el que usa el Agente para implementar. Nunca borrarlo.</w:t>
+      </w:r>
+    </w:p>
+    <w:p>
+      <w:pPr>
+        <w:pStyle w:val="Ttulo3"/>
+        <w:rPr>
+          <w:rFonts w:eastAsia="Times New Roman"/>
+        </w:rPr>
+      </w:pPr>
+      <w:r>
+        <w:rPr>
+          <w:rFonts w:eastAsia="Times New Roman"/>
+        </w:rPr>
+        <w:t>Paso 4 — Instalar instrucciones del Agente</w:t>
       </w:r>
     </w:p>
     <w:p>
       <w:pPr>
         <w:pStyle w:val="NormalWeb"/>
-        <w:divId w:val="1554849974"/>
-      </w:pPr>
-      <w:r>
-        <w:rPr>
-          <w:rStyle w:val="Fuerte"/>
-        </w:rPr>
-        <w:t>Nota:</w:t>
+      </w:pPr>
+      <w:r>
+        <w:t>El Agente no carga la configuración global de Claude — lee las instrucciones del repo donde trabaja (</w:t>
+      </w:r>
+      <w:r>
+        <w:rPr>
+          <w:rStyle w:val="CdigoHTML"/>
+        </w:rPr>
+        <w:t>.github\copilot-instructions.md</w:t>
+      </w:r>
+      <w:r>
+        <w:t>). Copiar la plantilla del repo de configuración:</w:t>
+      </w:r>
+    </w:p>
+    <w:p>
+      <w:pPr>
+        <w:pStyle w:val="HTMLconformatoprevio"/>
+        <w:rPr>
+          <w:rStyle w:val="CdigoHTML"/>
+        </w:rPr>
+      </w:pPr>
+      <w:r>
+        <w:rPr>
+          <w:rStyle w:val="CdigoHTML"/>
+        </w:rPr>
+        <w:t>New-Item -ItemType Directory -Force .github | Out-Null</w:t>
+      </w:r>
+    </w:p>
+    <w:p>
+      <w:pPr>
+        <w:pStyle w:val="HTMLconformatoprevio"/>
+        <w:rPr>
+          <w:rStyle w:val="CdigoHTML"/>
+        </w:rPr>
+      </w:pPr>
+      <w:r>
+        <w:rPr>
+          <w:rStyle w:val="CdigoHTML"/>
+        </w:rPr>
+        <w:t>cp "$env:SDD_CONFIG_REPO\templates\copilot-instructions.md" .github\copilot-instructions.md</w:t>
+      </w:r>
+    </w:p>
+    <w:p>
+      <w:pPr>
+        <w:pStyle w:val="NormalWeb"/>
+      </w:pPr>
+      <w:r>
+        <w:t xml:space="preserve">Si el proyecto ya tiene un </w:t>
+      </w:r>
+      <w:r>
+        <w:rPr>
+          <w:rStyle w:val="CdigoHTML"/>
+        </w:rPr>
+        <w:t>copilot-instructions.md</w:t>
       </w:r>
       <w:r>
         <w:t xml:space="preserve"> </w:t>
       </w:r>
       <w:r>
-        <w:rPr>
-          <w:rStyle w:val="CdigoHTML"/>
-        </w:rPr>
-        <w:t>.agent\skills\openspec-apply-change\SKILL.md</w:t>
-      </w:r>
-      <w:r>
-        <w:t xml:space="preserve"> es distinto — lo usa el Agente, no Claude Code. No borrarlo.</w:t>
+        <w:t>propio, fusionar la sección "Workflow SDD" al principio en vez de reemplazarlo.</w:t>
       </w:r>
     </w:p>
     <w:p>
@@ -213,7 +395,13 @@
         <w:rPr>
           <w:rFonts w:eastAsia="Times New Roman"/>
         </w:rPr>
-        <w:t>Paso 3 — Completar openspec/config.yaml</w:t>
+        <w:t xml:space="preserve">Paso 5 — Verificar el </w:t>
+      </w:r>
+      <w:r>
+        <w:rPr>
+          <w:rStyle w:val="CdigoHTML"/>
+        </w:rPr>
+        <w:t>.gitignore</w:t>
       </w:r>
     </w:p>
     <w:p>
@@ -221,7 +409,62 @@
         <w:pStyle w:val="NormalWeb"/>
       </w:pPr>
       <w:r>
-        <w:t>Decile a Claude qué hace el proyecto (frontend, backend, fullstack, qué stack usa) y te arma el config completo.</w:t>
+        <w:lastRenderedPageBreak/>
+        <w:t xml:space="preserve">Si el proyecto no tiene </w:t>
+      </w:r>
+      <w:r>
+        <w:rPr>
+          <w:rStyle w:val="CdigoHTML"/>
+        </w:rPr>
+        <w:t>.gitignore</w:t>
+      </w:r>
+      <w:r>
+        <w:t xml:space="preserve">, crearlo antes del primer commit. Mínimo obligatorio: </w:t>
+      </w:r>
+      <w:r>
+        <w:rPr>
+          <w:rStyle w:val="CdigoHTML"/>
+        </w:rPr>
+        <w:t>.env</w:t>
+      </w:r>
+      <w:r>
+        <w:t xml:space="preserve">, </w:t>
+      </w:r>
+      <w:r>
+        <w:rPr>
+          <w:rStyle w:val="CdigoHTML"/>
+        </w:rPr>
+        <w:t>*.env</w:t>
+      </w:r>
+      <w:r>
+        <w:t xml:space="preserve">, </w:t>
+      </w:r>
+      <w:r>
+        <w:rPr>
+          <w:rStyle w:val="CdigoHTML"/>
+        </w:rPr>
+        <w:t>*.key</w:t>
+      </w:r>
+      <w:r>
+        <w:t xml:space="preserve">, </w:t>
+      </w:r>
+      <w:r>
+        <w:rPr>
+          <w:rStyle w:val="CdigoHTML"/>
+        </w:rPr>
+        <w:t>*.pem</w:t>
+      </w:r>
+      <w:r>
+        <w:t xml:space="preserve">, </w:t>
+      </w:r>
+      <w:r>
+        <w:rPr>
+          <w:rStyle w:val="CdigoHTML"/>
+        </w:rPr>
+        <w:t>secrets/</w:t>
+      </w:r>
+      <w:r>
+        <w:t>.</w:t>
       </w:r>
     </w:p>
     <w:p>
@@ -235,33 +478,7 @@
         <w:rPr>
           <w:rFonts w:eastAsia="Times New Roman"/>
         </w:rPr>
-        <w:t xml:space="preserve">Paso 4 — Verificar que </w:t>
-      </w:r>
-      <w:r>
-        <w:rPr>
-          <w:rStyle w:val="CdigoHTML"/>
-        </w:rPr>
-        <w:t>.agent\skills\openspec-apply-change\SKILL.md</w:t>
-      </w:r>
-      <w:r>
-        <w:rPr>
-          <w:rFonts w:eastAsia="Times New Roman"/>
-        </w:rPr>
-        <w:t xml:space="preserve"> sigue intacto</w:t>
-      </w:r>
-    </w:p>
-    <w:p>
-      <w:pPr>
-        <w:pStyle w:val="HTMLconformatoprevio"/>
-        <w:rPr>
-          <w:rStyle w:val="CdigoHTML"/>
-        </w:rPr>
-      </w:pPr>
-      <w:r>
-        <w:rPr>
-          <w:rStyle w:val="CdigoHTML"/>
-        </w:rPr>
-        <w:t>ls .agent\skills\openspec-apply-change\</w:t>
+        <w:t>Si el proyecto ya tiene OpenSpec con copias locales de Claude</w:t>
       </w:r>
     </w:p>
     <w:p>
@@ -269,30 +486,53 @@
         <w:pStyle w:val="NormalWeb"/>
       </w:pPr>
       <w:r>
-        <w:t xml:space="preserve">Debe mostrar </w:t>
-      </w:r>
-      <w:r>
-        <w:rPr>
-          <w:rStyle w:val="CdigoHTML"/>
-        </w:rPr>
-        <w:t>SKILL.md</w:t>
-      </w:r>
-      <w:r>
-        <w:t xml:space="preserve"> — ese es el que usa el Agente para implementar. Nunca borrarlo.</w:t>
-      </w:r>
-    </w:p>
-    <w:p>
-      <w:pPr>
-        <w:pStyle w:val="Ttulo3"/>
-        <w:rPr>
-          <w:rFonts w:eastAsia="Times New Roman"/>
-        </w:rPr>
-      </w:pPr>
-      <w:r>
-        <w:rPr>
-          <w:rFonts w:eastAsia="Times New Roman"/>
-        </w:rPr>
-        <w:t>Paso 5 — Instalar instrucciones del Agente</w:t>
+        <w:t xml:space="preserve">Si el proyecto se inició con </w:t>
+      </w:r>
+      <w:r>
+        <w:rPr>
+          <w:rStyle w:val="CdigoHTML"/>
+        </w:rPr>
+        <w:t>claude</w:t>
+      </w:r>
+      <w:r>
+        <w:t xml:space="preserve"> en </w:t>
+      </w:r>
+      <w:r>
+        <w:rPr>
+          <w:rStyle w:val="CdigoHTML"/>
+        </w:rPr>
+        <w:t>--tools</w:t>
+      </w:r>
+      <w:r>
+        <w:t>, tiene copias locales por defecto que pisan a las globales. Eliminarlas:</w:t>
+      </w:r>
+    </w:p>
+    <w:p>
+      <w:pPr>
+        <w:pStyle w:val="HTMLconformatoprevio"/>
+        <w:rPr>
+          <w:rStyle w:val="CdigoHTML"/>
+        </w:rPr>
+      </w:pPr>
+      <w:r>
+        <w:rPr>
+          <w:rStyle w:val="CdigoHTML"/>
+        </w:rPr>
+        <w:t>rm .claude\commands\opsx\*.md</w:t>
+      </w:r>
+    </w:p>
+    <w:p>
+      <w:pPr>
+        <w:pStyle w:val="HTMLconformatoprevio"/>
+        <w:rPr>
+          <w:rStyle w:val="CdigoHTML"/>
+        </w:rPr>
+      </w:pPr>
+      <w:r>
+        <w:rPr>
+          <w:rStyle w:val="CdigoHTML"/>
+        </w:rPr>
+        <w:t>rm -r .claude\skills\openspec-*</w:t>
       </w:r>
     </w:p>
     <w:p>
@@ -300,157 +540,92 @@
         <w:pStyle w:val="NormalWeb"/>
       </w:pPr>
       <w:r>
-        <w:t>El Agente no carga la configuración global de Claude — lee las instrucciones del repo donde trabaja (</w:t>
-      </w:r>
-      <w:r>
-        <w:rPr>
-          <w:rStyle w:val="CdigoHTML"/>
-        </w:rPr>
-        <w:t>.github\copilot-instructions.md</w:t>
-      </w:r>
-      <w:r>
-        <w:t>). Copiar la plantilla del repo de configuración:</w:t>
-      </w:r>
-    </w:p>
-    <w:p>
-      <w:pPr>
-        <w:pStyle w:val="HTMLconformatoprevio"/>
-        <w:rPr>
-          <w:rStyle w:val="CdigoHTML"/>
-        </w:rPr>
-      </w:pPr>
-      <w:r>
-        <w:rPr>
-          <w:rStyle w:val="CdigoHTML"/>
-        </w:rPr>
-        <w:t>New-Item -ItemType Directory -Force .github | Out-Null</w:t>
-      </w:r>
-    </w:p>
-    <w:p>
-      <w:pPr>
-        <w:pStyle w:val="HTMLconformatoprevio"/>
-        <w:rPr>
-          <w:rStyle w:val="CdigoHTML"/>
-        </w:rPr>
-      </w:pPr>
-      <w:r>
-        <w:rPr>
-          <w:rStyle w:val="CdigoHTML"/>
-        </w:rPr>
-        <w:lastRenderedPageBreak/>
-        <w:t>cp "$env:SDD_CONFIG_REPO\templates\copilot-instructions.md" .github\copilot-instructions.md</w:t>
-      </w:r>
-    </w:p>
-    <w:p>
-      <w:pPr>
-        <w:pStyle w:val="NormalWeb"/>
-      </w:pPr>
-      <w:r>
-        <w:t xml:space="preserve">Si el proyecto ya tiene un </w:t>
-      </w:r>
-      <w:r>
-        <w:rPr>
-          <w:rStyle w:val="CdigoHTML"/>
-        </w:rPr>
-        <w:t>copilot-instructions.md</w:t>
-      </w:r>
-      <w:r>
-        <w:t xml:space="preserve"> propio, fusionar la sección "Workflow SDD" al principio en vez de reemplazarlo.</w:t>
-      </w:r>
-    </w:p>
-    <w:p>
-      <w:pPr>
-        <w:pStyle w:val="Ttulo3"/>
-        <w:rPr>
-          <w:rFonts w:eastAsia="Times New Roman"/>
-        </w:rPr>
-      </w:pPr>
-      <w:r>
-        <w:rPr>
-          <w:rFonts w:eastAsia="Times New Roman"/>
-        </w:rPr>
-        <w:t xml:space="preserve">Paso 6 — Verificar el </w:t>
-      </w:r>
-      <w:r>
-        <w:rPr>
-          <w:rStyle w:val="CdigoHTML"/>
-        </w:rPr>
-        <w:t>.gitignore</w:t>
-      </w:r>
-    </w:p>
-    <w:p>
-      <w:pPr>
-        <w:pStyle w:val="NormalWeb"/>
-      </w:pPr>
-      <w:r>
-        <w:t xml:space="preserve">Si el proyecto no tiene </w:t>
-      </w:r>
-      <w:r>
-        <w:rPr>
-          <w:rStyle w:val="CdigoHTML"/>
-        </w:rPr>
-        <w:t>.gitignore</w:t>
-      </w:r>
-      <w:r>
-        <w:t xml:space="preserve">, crearlo antes del primer commit. Mínimo obligatorio: </w:t>
-      </w:r>
-      <w:r>
-        <w:rPr>
-          <w:rStyle w:val="CdigoHTML"/>
-        </w:rPr>
-        <w:t>.env</w:t>
-      </w:r>
-      <w:r>
-        <w:t xml:space="preserve">, </w:t>
-      </w:r>
-      <w:r>
-        <w:rPr>
-          <w:rStyle w:val="CdigoHTML"/>
-        </w:rPr>
-        <w:t>*.env</w:t>
-      </w:r>
-      <w:r>
-        <w:t xml:space="preserve">, </w:t>
-      </w:r>
-      <w:r>
-        <w:rPr>
-          <w:rStyle w:val="CdigoHTML"/>
-        </w:rPr>
-        <w:t>*.key</w:t>
-      </w:r>
-      <w:r>
-        <w:t xml:space="preserve">, </w:t>
-      </w:r>
-      <w:r>
-        <w:rPr>
-          <w:rStyle w:val="CdigoHTML"/>
-        </w:rPr>
-        <w:t>*.pem</w:t>
-      </w:r>
-      <w:r>
-        <w:t xml:space="preserve">, </w:t>
-      </w:r>
-      <w:r>
-        <w:rPr>
-          <w:rStyle w:val="CdigoHTML"/>
-        </w:rPr>
-        <w:t>secrets/</w:t>
-      </w:r>
-      <w:r>
-        <w:t>.</w:t>
-      </w:r>
-    </w:p>
-    <w:p>
-      <w:pPr>
-        <w:rPr>
-          <w:rFonts w:eastAsia="Times New Roman"/>
-        </w:rPr>
-      </w:pPr>
-      <w:r>
-        <w:rPr>
-          <w:rFonts w:eastAsia="Times New Roman"/>
-        </w:rPr>
-        <w:pict w14:anchorId="74DDE0F4">
+        <w:t xml:space="preserve">Si esos archivos están versionados, commiteá la eliminación aparte (por ejemplo </w:t>
+      </w:r>
+      <w:r>
+        <w:rPr>
+          <w:rStyle w:val="CdigoHTML"/>
+        </w:rPr>
+        <w:t>chore: usar los comandos globales de OpenSpec</w:t>
+      </w:r>
+      <w:r>
+        <w:t xml:space="preserve">), desde la rama principal y con el árbol limpio: no la hagas dentro de una rama </w:t>
+      </w:r>
+      <w:r>
+        <w:rPr>
+          <w:rStyle w:val="CdigoHTML"/>
+        </w:rPr>
+        <w:t>change/…</w:t>
+      </w:r>
+      <w:r>
+        <w:t xml:space="preserve">, porque mezclaría un commit sin el </w:t>
+      </w:r>
+      <w:r>
+        <w:rPr>
+          <w:rStyle w:val="CdigoHTML"/>
+        </w:rPr>
+        <w:t>Spec-ID</w:t>
+      </w:r>
+      <w:r>
+        <w:t xml:space="preserve"> de ese change. </w:t>
+      </w:r>
+      <w:r>
+        <w:rPr>
+          <w:rStyle w:val="CdigoHTML"/>
+        </w:rPr>
+        <w:t>openspec update</w:t>
+      </w:r>
+      <w:r>
+        <w:t xml:space="preserve"> no las vuelve a generar mientras no uses </w:t>
+      </w:r>
+      <w:r>
+        <w:rPr>
+          <w:rStyle w:val="CdigoHTML"/>
+        </w:rPr>
+        <w:t>claude</w:t>
+      </w:r>
+      <w:r>
+        <w:t xml:space="preserve"> en </w:t>
+      </w:r>
+      <w:r>
+        <w:rPr>
+          <w:rStyle w:val="CdigoHTML"/>
+        </w:rPr>
+        <w:t>--tools</w:t>
+      </w:r>
+      <w:r>
+        <w:t xml:space="preserve">. Borrá solo esas carpetas, no el resto de </w:t>
+      </w:r>
+      <w:r>
+        <w:rPr>
+          <w:rStyle w:val="CdigoHTML"/>
+        </w:rPr>
+        <w:t>.claude\</w:t>
+      </w:r>
+      <w:r>
+        <w:t xml:space="preserve"> (por ejemplo </w:t>
+      </w:r>
+      <w:r>
+        <w:rPr>
+          <w:rStyle w:val="CdigoHTML"/>
+        </w:rPr>
+        <w:t>settings.local.json</w:t>
+      </w:r>
+      <w:r>
+        <w:t>).</w:t>
+      </w:r>
+    </w:p>
+    <w:p>
+      <w:pPr>
+        <w:rPr>
+          <w:rFonts w:eastAsia="Times New Roman"/>
+        </w:rPr>
+      </w:pPr>
+      <w:r>
+        <w:rPr>
+          <w:rFonts w:eastAsia="Times New Roman"/>
+        </w:rPr>
+        <w:pict w14:anchorId="1FB44558">
           <v:rect id="_x0000_i1025" style="width:0;height:1.5pt" o:hralign="center" o:hrstd="t" o:hr="t" fillcolor="#a0a0a0" stroked="f"/>
         </w:pict>
       </w:r>
@@ -497,7 +672,7 @@
         <w:rPr>
           <w:rStyle w:val="CdigoHTML"/>
         </w:rPr>
-        <w:t># Reglas globales de Claude + skills (desde el repo clonado)</w:t>
+        <w:t># Reglas globales de Claude, skills y comandos /opsx (desde el repo clonado)</w:t>
       </w:r>
     </w:p>
     <w:p>
@@ -525,7 +700,49 @@
         <w:rPr>
           <w:rStyle w:val="CdigoHTML"/>
         </w:rPr>
-        <w:t># ... skills según README</w:t>
+        <w:t>New-Item -ItemType Directory -Force "$env:USERPROFILE\.claude\skills" | Out-Null</w:t>
+      </w:r>
+    </w:p>
+    <w:p>
+      <w:pPr>
+        <w:pStyle w:val="HTMLconformatoprevio"/>
+        <w:rPr>
+          <w:rStyle w:val="CdigoHTML"/>
+        </w:rPr>
+      </w:pPr>
+      <w:r>
+        <w:rPr>
+          <w:rStyle w:val="CdigoHTML"/>
+        </w:rPr>
+        <w:t>New-Item -ItemType Directory -Force "$env:USERPROFILE\.claude\commands\opsx" | Out-Null</w:t>
+      </w:r>
+    </w:p>
+    <w:p>
+      <w:pPr>
+        <w:pStyle w:val="HTMLconformatoprevio"/>
+        <w:rPr>
+          <w:rStyle w:val="CdigoHTML"/>
+        </w:rPr>
+      </w:pPr>
+      <w:r>
+        <w:rPr>
+          <w:rStyle w:val="CdigoHTML"/>
+        </w:rPr>
+        <w:t>cp -r skills\* "$env:USERPROFILE\.claude\skills\"</w:t>
+      </w:r>
+    </w:p>
+    <w:p>
+      <w:pPr>
+        <w:pStyle w:val="HTMLconformatoprevio"/>
+        <w:rPr>
+          <w:rStyle w:val="CdigoHTML"/>
+        </w:rPr>
+      </w:pPr>
+      <w:r>
+        <w:rPr>
+          <w:rStyle w:val="CdigoHTML"/>
+        </w:rPr>
+        <w:t>cp .claude\commands\opsx\*.md "$env:USERPROFILE\.claude\commands\opsx\"</w:t>
       </w:r>
     </w:p>
     <w:p>
@@ -711,7 +928,8 @@
         <w:pStyle w:val="NormalWeb"/>
       </w:pPr>
       <w:r>
-        <w:t xml:space="preserve">Claude y el Agente cargan su configuración global en todos los proyectos; el paso 5 por proyecto aplica al agente que lee </w:t>
+        <w:lastRenderedPageBreak/>
+        <w:t xml:space="preserve">Claude y el Agente cargan su configuración global en todos los proyectos; el paso 4 por proyecto aplica al agente que lee </w:t>
       </w:r>
       <w:r>
         <w:rPr>
@@ -733,7 +951,7 @@
         <w:rPr>
           <w:rFonts w:eastAsia="Times New Roman"/>
         </w:rPr>
-        <w:pict w14:anchorId="7F0BE513">
+        <w:pict w14:anchorId="61D5012E">
           <v:rect id="_x0000_i1026" style="width:0;height:1.5pt" o:hralign="center" o:hrstd="t" o:hr="t" fillcolor="#a0a0a0" stroked="f"/>
         </w:pict>
       </w:r>
@@ -791,27 +1009,20 @@
         <w:rPr>
           <w:rStyle w:val="CdigoHTML"/>
         </w:rPr>
-        <w:t xml:space="preserve">Agente   /openspec-apply-change        </w:t>
-      </w:r>
-      <w:r>
-        <w:rPr>
-          <w:rStyle w:val="CdigoHTML"/>
-        </w:rPr>
-        <w:t>→ implementa en el branch, commitea con Spec-ID:</w:t>
-      </w:r>
-    </w:p>
-    <w:p>
-      <w:pPr>
-        <w:pStyle w:val="HTMLconformatoprevio"/>
-        <w:rPr>
-          <w:rStyle w:val="CdigoHTML"/>
-        </w:rPr>
-      </w:pPr>
-      <w:r>
-        <w:rPr>
-          <w:rStyle w:val="CdigoHTML"/>
-        </w:rPr>
-        <w:lastRenderedPageBreak/>
+        <w:t>Agente   /openspec-apply-change        → implementa en el branch, commitea con Spec-ID:</w:t>
+      </w:r>
+    </w:p>
+    <w:p>
+      <w:pPr>
+        <w:pStyle w:val="HTMLconformatoprevio"/>
+        <w:rPr>
+          <w:rStyle w:val="CdigoHTML"/>
+        </w:rPr>
+      </w:pPr>
+      <w:r>
+        <w:rPr>
+          <w:rStyle w:val="CdigoHTML"/>
+        </w:rPr>
         <w:t>Claude   /branch-pr &lt;nombre&gt;           → valida commits, abre PR desde Obsidian decisions/</w:t>
       </w:r>
     </w:p>
@@ -854,7 +1065,13 @@
         <w:rPr>
           <w:rStyle w:val="CdigoHTML"/>
         </w:rPr>
-        <w:t>Claude   /opsx:archive &lt;nombre&gt;        → archiva + escribe Obsidian archive/ (post-merge)</w:t>
+        <w:t xml:space="preserve">Claude </w:t>
+      </w:r>
+      <w:r>
+        <w:rPr>
+          <w:rStyle w:val="CdigoHTML"/>
+        </w:rPr>
+        <w:t xml:space="preserve">  /opsx:archive &lt;nombre&gt;        → archiva + escribe Obsidian archive/ (post-merge)</w:t>
       </w:r>
     </w:p>
     <w:p>
@@ -1080,10 +1297,7 @@
         <w:t>context.md</w:t>
       </w:r>
       <w:r>
-        <w:t xml:space="preserve"> </w:t>
-      </w:r>
-      <w:r>
-        <w:t xml:space="preserve">y crea el branch </w:t>
+        <w:t xml:space="preserve"> y crea el branch </w:t>
       </w:r>
       <w:r>
         <w:rPr>
@@ -1367,7 +1581,7 @@
         <w:rPr>
           <w:rFonts w:eastAsia="Times New Roman"/>
         </w:rPr>
-        <w:pict w14:anchorId="06601499">
+        <w:pict w14:anchorId="439B351A">
           <v:rect id="_x0000_i1027" style="width:0;height:1.5pt" o:hralign="center" o:hrstd="t" o:hr="t" fillcolor="#a0a0a0" stroked="f"/>
         </w:pict>
       </w:r>
@@ -1582,7 +1796,7 @@
         <w:rPr>
           <w:rFonts w:eastAsia="Times New Roman"/>
         </w:rPr>
-        <w:pict w14:anchorId="2F02ED73">
+        <w:pict w14:anchorId="3450F5CC">
           <v:rect id="_x0000_i1028" style="width:0;height:1.5pt" o:hralign="center" o:hrstd="t" o:hr="t" fillcolor="#a0a0a0" stroked="f"/>
         </w:pict>
       </w:r>
@@ -1716,13 +1930,7 @@
         <w:rPr>
           <w:rFonts w:eastAsia="Times New Roman"/>
         </w:rPr>
-        <w:t xml:space="preserve"> </w:t>
-      </w:r>
-      <w:r>
-        <w:rPr>
-          <w:rFonts w:eastAsia="Times New Roman"/>
-        </w:rPr>
-        <w:t xml:space="preserve">— types: </w:t>
+        <w:t xml:space="preserve"> — types: </w:t>
       </w:r>
       <w:r>
         <w:rPr>
@@ -1977,7 +2185,7 @@
         <w:rPr>
           <w:rFonts w:eastAsia="Times New Roman"/>
         </w:rPr>
-        <w:pict w14:anchorId="1E5C33A4">
+        <w:pict w14:anchorId="20F2544D">
           <v:rect id="_x0000_i1029" style="width:0;height:1.5pt" o:hralign="center" o:hrstd="t" o:hr="t" fillcolor="#a0a0a0" stroked="f"/>
         </w:pict>
       </w:r>
@@ -2010,10 +2218,7 @@
         <w:t>$env:OBSIDIAN_VAULT</w:t>
       </w:r>
       <w:r>
-        <w:t xml:space="preserve"> </w:t>
-      </w:r>
-      <w:r>
-        <w:t>actúa como memoria persistente del proyecto — equivalente a Engram pero sobre el filesystem local. Claude lee y escribe automáticamente en cada operación OPSX, sin MCP ni plugins.</w:t>
+        <w:t xml:space="preserve"> actúa como memoria persistente del proyecto — equivalente a Engram pero sobre el filesystem local. Claude lee y escribe automáticamente en cada operación OPSX, sin MCP ni plugins.</w:t>
       </w:r>
     </w:p>
     <w:p>
@@ -2137,7 +2342,13 @@
         <w:rPr>
           <w:rStyle w:val="CdigoHTML"/>
         </w:rPr>
-        <w:t xml:space="preserve">      context.md                    </w:t>
+        <w:t xml:space="preserve">      context.md    </w:t>
+      </w:r>
+      <w:r>
+        <w:rPr>
+          <w:rStyle w:val="CdigoHTML"/>
+        </w:rPr>
+        <w:t xml:space="preserve">                </w:t>
       </w:r>
       <w:r>
         <w:rPr>
@@ -3115,9 +3326,9 @@
 <file path=word/numbering.xml><?xml version="1.0" encoding="utf-8"?>
 <w:numbering xmlns:wpc="http://schemas.microsoft.com/office/word/2010/wordprocessingCanvas" xmlns:cx="http://schemas.microsoft.com/office/drawing/2014/chartex" xmlns:cx1="http://schemas.microsoft.com/office/drawing/2015/9/8/chartex" xmlns:cx2="http://schemas.microsoft.com/office/drawing/2015/10/21/chartex" xmlns:cx3="http://schemas.microsoft.com/office/drawing/2016/5/9/chartex" xmlns:cx4="http://schemas.microsoft.com/office/drawing/2016/5/10/chartex" xmlns:cx5="http://schemas.microsoft.com/office/drawing/2016/5/11/chartex" xmlns:cx6="http://schemas.microsoft.com/office/drawing/2016/5/12/chartex" xmlns:cx7="http://schemas.microsoft.com/office/drawing/2016/5/13/chartex" xmlns:cx8="http://schemas.microsoft.com/office/drawing/2016/5/14/chartex" xmlns:mc="http://schemas.openxmlformats.org/markup-compatibility/2006" xmlns:aink="http://schemas.microsoft.com/office/drawing/2016/ink" xmlns:am3d="http://schemas.microsoft.com/office/drawing/2017/model3d" xmlns:o="urn:schemas-microsoft-com:office:office" xmlns:oel="http://schemas.microsoft.com/office/2019/extlst" xmlns:r="http://schemas.openxmlformats.org/officeDocument/2006/relationships" xmlns:m="http://schemas.openxmlformats.org/officeDocument/2006/math" xmlns:v="urn:schemas-microsoft-com:vml" xmlns:wp14="http://schemas.microsoft.com/office/word/2010/wordprocessingDrawing" xmlns:wp="http://schemas.openxmlformats.org/drawingml/2006/wordprocessingDrawing" xmlns:w10="urn:schemas-microsoft-com:office:word" xmlns:w="http://schemas.openxmlformats.org/wordprocessingml/2006/main" xmlns:w14="http://schemas.microsoft.com/office/word/2010/wordml" xmlns:w15="http://schemas.microsoft.com/office/word/2012/wordml" xmlns:w16cex="http://schemas.microsoft.com/office/word/2018/wordml/cex" xmlns:w16cid="http://schemas.microsoft.com/office/word/2016/wordml/cid" xmlns:w16="http://schemas.microsoft.com/office/word/2018/wordml" xmlns:w16du="http://schemas.microsoft.com/office/word/2023/wordml/word16du" xmlns:w16sdtdh="http://schemas.microsoft.com/office/word/2020/wordml/sdtdatahash" xmlns:w16sdtfl="http://schemas.microsoft.com/office/word/2024/wordml/sdtformatlock" xmlns:w16se="http://schemas.microsoft.com/office/word/2015/wordml/symex" xmlns:wpg="http://schemas.microsoft.com/office/word/2010/wordprocessingGroup" xmlns:wpi="http://schemas.microsoft.com/office/word/2010/wordprocessingInk" xmlns:wne="http://schemas.microsoft.com/office/word/2006/wordml" xmlns:wps="http://schemas.microsoft.com/office/word/2010/wordprocessingShape" mc:Ignorable="w14 w15 w16se w16cid w16 w16cex w16sdtdh w16sdtfl w16du wp14">
   <w:abstractNum w:abstractNumId="0" w15:restartNumberingAfterBreak="0">
-    <w:nsid w:val="1AD3441B"/>
+    <w:nsid w:val="452262C0"/>
     <w:multiLevelType w:val="multilevel"/>
-    <w:tmpl w:val="E08AB5E8"/>
+    <w:tmpl w:val="C0BC6E5E"/>
     <w:lvl w:ilvl="0">
       <w:start w:val="1"/>
       <w:numFmt w:val="bullet"/>
@@ -3264,9 +3475,9 @@
     </w:lvl>
   </w:abstractNum>
   <w:abstractNum w:abstractNumId="1" w15:restartNumberingAfterBreak="0">
-    <w:nsid w:val="1CDC542E"/>
+    <w:nsid w:val="4CAB7B42"/>
     <w:multiLevelType w:val="multilevel"/>
-    <w:tmpl w:val="684498E6"/>
+    <w:tmpl w:val="D50851EA"/>
     <w:lvl w:ilvl="0">
       <w:start w:val="1"/>
       <w:numFmt w:val="bullet"/>
@@ -3413,9 +3624,9 @@
     </w:lvl>
   </w:abstractNum>
   <w:abstractNum w:abstractNumId="2" w15:restartNumberingAfterBreak="0">
-    <w:nsid w:val="20DC4203"/>
+    <w:nsid w:val="570D6836"/>
     <w:multiLevelType w:val="multilevel"/>
-    <w:tmpl w:val="5BE4D5F4"/>
+    <w:tmpl w:val="69369690"/>
     <w:lvl w:ilvl="0">
       <w:start w:val="1"/>
       <w:numFmt w:val="bullet"/>
@@ -3562,9 +3773,9 @@
     </w:lvl>
   </w:abstractNum>
   <w:abstractNum w:abstractNumId="3" w15:restartNumberingAfterBreak="0">
-    <w:nsid w:val="460B4EDB"/>
+    <w:nsid w:val="5FCF4527"/>
     <w:multiLevelType w:val="multilevel"/>
-    <w:tmpl w:val="F3D4CFA2"/>
+    <w:tmpl w:val="7042EF96"/>
     <w:lvl w:ilvl="0">
       <w:start w:val="1"/>
       <w:numFmt w:val="bullet"/>
@@ -3711,9 +3922,9 @@
     </w:lvl>
   </w:abstractNum>
   <w:abstractNum w:abstractNumId="4" w15:restartNumberingAfterBreak="0">
-    <w:nsid w:val="5F5C17C4"/>
+    <w:nsid w:val="66F87C8C"/>
     <w:multiLevelType w:val="multilevel"/>
-    <w:tmpl w:val="FECA3D22"/>
+    <w:tmpl w:val="C178BED8"/>
     <w:lvl w:ilvl="0">
       <w:start w:val="1"/>
       <w:numFmt w:val="bullet"/>
@@ -3860,9 +4071,9 @@
     </w:lvl>
   </w:abstractNum>
   <w:abstractNum w:abstractNumId="5" w15:restartNumberingAfterBreak="0">
-    <w:nsid w:val="78D02190"/>
+    <w:nsid w:val="795C1E43"/>
     <w:multiLevelType w:val="multilevel"/>
-    <w:tmpl w:val="A5D8E552"/>
+    <w:tmpl w:val="63A8A562"/>
     <w:lvl w:ilvl="0">
       <w:start w:val="1"/>
       <w:numFmt w:val="bullet"/>
@@ -4008,23 +4219,23 @@
       </w:rPr>
     </w:lvl>
   </w:abstractNum>
-  <w:num w:numId="1" w16cid:durableId="277489951">
+  <w:num w:numId="1" w16cid:durableId="1082600943">
+    <w:abstractNumId w:val="0"/>
+  </w:num>
+  <w:num w:numId="2" w16cid:durableId="1961298370">
+    <w:abstractNumId w:val="4"/>
+  </w:num>
+  <w:num w:numId="3" w16cid:durableId="378283873">
     <w:abstractNumId w:val="5"/>
   </w:num>
-  <w:num w:numId="2" w16cid:durableId="2063288308">
+  <w:num w:numId="4" w16cid:durableId="1919367530">
     <w:abstractNumId w:val="3"/>
   </w:num>
-  <w:num w:numId="3" w16cid:durableId="148637443">
-    <w:abstractNumId w:val="0"/>
-  </w:num>
-  <w:num w:numId="4" w16cid:durableId="246381717">
-    <w:abstractNumId w:val="1"/>
-  </w:num>
-  <w:num w:numId="5" w16cid:durableId="1144274190">
+  <w:num w:numId="5" w16cid:durableId="989675779">
     <w:abstractNumId w:val="2"/>
   </w:num>
-  <w:num w:numId="6" w16cid:durableId="1191141975">
-    <w:abstractNumId w:val="4"/>
+  <w:num w:numId="6" w16cid:durableId="179660480">
+    <w:abstractNumId w:val="1"/>
   </w:num>
 </w:numbering>
 </file>

</xml_diff>

<commit_message>
feat: organizar templates por agente y prender statusLine en Antigravity
Spec-ID: plantillas-por-agente
</commit_message>
<xml_diff>
--- a/docs/modo-de-uso.docx
+++ b/docs/modo-de-uso.docx
@@ -564,7 +564,7 @@
         <w:rPr>
           <w:rStyle w:val="StringTok"/>
         </w:rPr>
-        <w:t xml:space="preserve">\templates\copilot-instructions.md"</w:t>
+        <w:t xml:space="preserve">\templates\copilot\copilot-instructions.md"</w:t>
       </w:r>
       <w:r>
         <w:rPr>
@@ -589,6 +589,69 @@
           <w:rStyle w:val="NormalTok"/>
         </w:rPr>
         <w:t xml:space="preserve">\copilot-instructions</w:t>
+      </w:r>
+      <w:r>
+        <w:rPr>
+          <w:rStyle w:val="OperatorTok"/>
+        </w:rPr>
+        <w:t xml:space="preserve">.</w:t>
+      </w:r>
+      <w:r>
+        <w:rPr>
+          <w:rStyle w:val="FunctionTok"/>
+        </w:rPr>
+        <w:t xml:space="preserve">md</w:t>
+      </w:r>
+      <w:r>
+        <w:br/>
+      </w:r>
+      <w:r>
+        <w:rPr>
+          <w:rStyle w:val="FunctionTok"/>
+        </w:rPr>
+        <w:t xml:space="preserve">cp</w:t>
+      </w:r>
+      <w:r>
+        <w:rPr>
+          <w:rStyle w:val="NormalTok"/>
+        </w:rPr>
+        <w:t xml:space="preserve"> </w:t>
+      </w:r>
+      <w:r>
+        <w:rPr>
+          <w:rStyle w:val="StringTok"/>
+        </w:rPr>
+        <w:t xml:space="preserve">"</w:t>
+      </w:r>
+      <w:r>
+        <w:rPr>
+          <w:rStyle w:val="VariableTok"/>
+        </w:rPr>
+        <w:t xml:space="preserve">$env</w:t>
+      </w:r>
+      <w:r>
+        <w:rPr>
+          <w:rStyle w:val="OperatorTok"/>
+        </w:rPr>
+        <w:t xml:space="preserve">:</w:t>
+      </w:r>
+      <w:r>
+        <w:rPr>
+          <w:rStyle w:val="VariableTok"/>
+        </w:rPr>
+        <w:t xml:space="preserve">SDD_CONFIG_REPO</w:t>
+      </w:r>
+      <w:r>
+        <w:rPr>
+          <w:rStyle w:val="StringTok"/>
+        </w:rPr>
+        <w:t xml:space="preserve">\templates\comun\AGENTS.md"</w:t>
+      </w:r>
+      <w:r>
+        <w:rPr>
+          <w:rStyle w:val="NormalTok"/>
+        </w:rPr>
+        <w:t xml:space="preserve"> AGENTS</w:t>
       </w:r>
       <w:r>
         <w:rPr>
@@ -1486,7 +1549,7 @@
         <w:rPr>
           <w:rStyle w:val="NormalTok"/>
         </w:rPr>
-        <w:t xml:space="preserve"> templates\GEMINI</w:t>
+        <w:t xml:space="preserve"> templates\gemini\GEMINI</w:t>
       </w:r>
       <w:r>
         <w:rPr>
@@ -1771,7 +1834,7 @@
         <w:rPr>
           <w:rStyle w:val="NormalTok"/>
         </w:rPr>
-        <w:t xml:space="preserve"> templates\antigravity-settings</w:t>
+        <w:t xml:space="preserve"> templates\antigravity\settings</w:t>
       </w:r>
       <w:r>
         <w:rPr>
@@ -1828,7 +1891,7 @@
         <w:rPr>
           <w:rStyle w:val="CommentTok"/>
         </w:rPr>
-        <w:t xml:space="preserve"># Completar en settings.json: {RUTA-DE-TU-USUARIO} y los trustedWorkspaces (ver templates\README.md)</w:t>
+        <w:t xml:space="preserve"># Completar en settings.json: {RUTA-DE-TU-USUARIO} y los trustedWorkspaces (ver templates\antigravity\README.md)</w:t>
       </w:r>
       <w:r>
         <w:br/>
@@ -1837,7 +1900,7 @@
         <w:rPr>
           <w:rStyle w:val="CommentTok"/>
         </w:rPr>
-        <w:t xml:space="preserve"># La barra de estado no se copia: se genera con el CLI del Agente (prompt en templates\README.md, sección "Barra de estado")</w:t>
+        <w:t xml:space="preserve"># La barra de estado no se copia: se genera con el CLI del Agente (prompt en templates\antigravity\README.md, sección "Barra de estado")</w:t>
       </w:r>
       <w:r>
         <w:br/>
@@ -5764,13 +5827,239 @@
       <w:bCs/>
     </w:rPr>
   </w:style>
-  <w:style w:type="paragraph" w:customStyle="1" w:styleId="SourceCode">
+  <w:style w:customStyle="1" w:styleId="SourceCode" w:type="paragraph">
     <w:name w:val="Source Code"/>
     <w:basedOn w:val="Normal"/>
     <w:link w:val="VerbatimChar"/>
     <w:pPr>
       <w:wordWrap w:val="off"/>
     </w:pPr>
+  </w:style>
+  <w:style w:customStyle="1" w:styleId="KeywordTok" w:type="character">
+    <w:name w:val="KeywordTok"/>
+    <w:basedOn w:val="VerbatimChar"/>
+    <w:rPr>
+      <w:b/>
+      <w:color w:val="007020"/>
+    </w:rPr>
+  </w:style>
+  <w:style w:customStyle="1" w:styleId="DataTypeTok" w:type="character">
+    <w:name w:val="DataTypeTok"/>
+    <w:basedOn w:val="VerbatimChar"/>
+    <w:rPr>
+      <w:color w:val="902000"/>
+    </w:rPr>
+  </w:style>
+  <w:style w:customStyle="1" w:styleId="DecValTok" w:type="character">
+    <w:name w:val="DecValTok"/>
+    <w:basedOn w:val="VerbatimChar"/>
+    <w:rPr>
+      <w:color w:val="40a070"/>
+    </w:rPr>
+  </w:style>
+  <w:style w:customStyle="1" w:styleId="BaseNTok" w:type="character">
+    <w:name w:val="BaseNTok"/>
+    <w:basedOn w:val="VerbatimChar"/>
+    <w:rPr>
+      <w:color w:val="40a070"/>
+    </w:rPr>
+  </w:style>
+  <w:style w:customStyle="1" w:styleId="FloatTok" w:type="character">
+    <w:name w:val="FloatTok"/>
+    <w:basedOn w:val="VerbatimChar"/>
+    <w:rPr>
+      <w:color w:val="40a070"/>
+    </w:rPr>
+  </w:style>
+  <w:style w:customStyle="1" w:styleId="ConstantTok" w:type="character">
+    <w:name w:val="ConstantTok"/>
+    <w:basedOn w:val="VerbatimChar"/>
+    <w:rPr>
+      <w:color w:val="880000"/>
+    </w:rPr>
+  </w:style>
+  <w:style w:customStyle="1" w:styleId="CharTok" w:type="character">
+    <w:name w:val="CharTok"/>
+    <w:basedOn w:val="VerbatimChar"/>
+    <w:rPr>
+      <w:color w:val="4070a0"/>
+    </w:rPr>
+  </w:style>
+  <w:style w:customStyle="1" w:styleId="SpecialCharTok" w:type="character">
+    <w:name w:val="SpecialCharTok"/>
+    <w:basedOn w:val="VerbatimChar"/>
+    <w:rPr>
+      <w:color w:val="4070a0"/>
+    </w:rPr>
+  </w:style>
+  <w:style w:customStyle="1" w:styleId="StringTok" w:type="character">
+    <w:name w:val="StringTok"/>
+    <w:basedOn w:val="VerbatimChar"/>
+    <w:rPr>
+      <w:color w:val="4070a0"/>
+    </w:rPr>
+  </w:style>
+  <w:style w:customStyle="1" w:styleId="VerbatimStringTok" w:type="character">
+    <w:name w:val="VerbatimStringTok"/>
+    <w:basedOn w:val="VerbatimChar"/>
+    <w:rPr>
+      <w:color w:val="4070a0"/>
+    </w:rPr>
+  </w:style>
+  <w:style w:customStyle="1" w:styleId="SpecialStringTok" w:type="character">
+    <w:name w:val="SpecialStringTok"/>
+    <w:basedOn w:val="VerbatimChar"/>
+    <w:rPr>
+      <w:color w:val="bb6688"/>
+    </w:rPr>
+  </w:style>
+  <w:style w:customStyle="1" w:styleId="ImportTok" w:type="character">
+    <w:name w:val="ImportTok"/>
+    <w:basedOn w:val="VerbatimChar"/>
+    <w:rPr>
+      <w:b/>
+      <w:color w:val="008000"/>
+    </w:rPr>
+  </w:style>
+  <w:style w:customStyle="1" w:styleId="CommentTok" w:type="character">
+    <w:name w:val="CommentTok"/>
+    <w:basedOn w:val="VerbatimChar"/>
+    <w:rPr>
+      <w:i/>
+      <w:color w:val="60a0b0"/>
+    </w:rPr>
+  </w:style>
+  <w:style w:customStyle="1" w:styleId="DocumentationTok" w:type="character">
+    <w:name w:val="DocumentationTok"/>
+    <w:basedOn w:val="VerbatimChar"/>
+    <w:rPr>
+      <w:i/>
+      <w:color w:val="ba2121"/>
+    </w:rPr>
+  </w:style>
+  <w:style w:customStyle="1" w:styleId="AnnotationTok" w:type="character">
+    <w:name w:val="AnnotationTok"/>
+    <w:basedOn w:val="VerbatimChar"/>
+    <w:rPr>
+      <w:b/>
+      <w:i/>
+      <w:color w:val="60a0b0"/>
+    </w:rPr>
+  </w:style>
+  <w:style w:customStyle="1" w:styleId="CommentVarTok" w:type="character">
+    <w:name w:val="CommentVarTok"/>
+    <w:basedOn w:val="VerbatimChar"/>
+    <w:rPr>
+      <w:b/>
+      <w:i/>
+      <w:color w:val="60a0b0"/>
+    </w:rPr>
+  </w:style>
+  <w:style w:customStyle="1" w:styleId="OtherTok" w:type="character">
+    <w:name w:val="OtherTok"/>
+    <w:basedOn w:val="VerbatimChar"/>
+    <w:rPr>
+      <w:color w:val="007020"/>
+    </w:rPr>
+  </w:style>
+  <w:style w:customStyle="1" w:styleId="FunctionTok" w:type="character">
+    <w:name w:val="FunctionTok"/>
+    <w:basedOn w:val="VerbatimChar"/>
+    <w:rPr>
+      <w:color w:val="06287e"/>
+    </w:rPr>
+  </w:style>
+  <w:style w:customStyle="1" w:styleId="VariableTok" w:type="character">
+    <w:name w:val="VariableTok"/>
+    <w:basedOn w:val="VerbatimChar"/>
+    <w:rPr>
+      <w:color w:val="19177c"/>
+    </w:rPr>
+  </w:style>
+  <w:style w:customStyle="1" w:styleId="ControlFlowTok" w:type="character">
+    <w:name w:val="ControlFlowTok"/>
+    <w:basedOn w:val="VerbatimChar"/>
+    <w:rPr>
+      <w:b/>
+      <w:color w:val="007020"/>
+    </w:rPr>
+  </w:style>
+  <w:style w:customStyle="1" w:styleId="OperatorTok" w:type="character">
+    <w:name w:val="OperatorTok"/>
+    <w:basedOn w:val="VerbatimChar"/>
+    <w:rPr>
+      <w:color w:val="666666"/>
+    </w:rPr>
+  </w:style>
+  <w:style w:customStyle="1" w:styleId="BuiltInTok" w:type="character">
+    <w:name w:val="BuiltInTok"/>
+    <w:basedOn w:val="VerbatimChar"/>
+    <w:rPr>
+      <w:color w:val="008000"/>
+    </w:rPr>
+  </w:style>
+  <w:style w:customStyle="1" w:styleId="ExtensionTok" w:type="character">
+    <w:name w:val="ExtensionTok"/>
+    <w:basedOn w:val="VerbatimChar"/>
+    <w:rPr/>
+  </w:style>
+  <w:style w:customStyle="1" w:styleId="PreprocessorTok" w:type="character">
+    <w:name w:val="PreprocessorTok"/>
+    <w:basedOn w:val="VerbatimChar"/>
+    <w:rPr>
+      <w:color w:val="bc7a00"/>
+    </w:rPr>
+  </w:style>
+  <w:style w:customStyle="1" w:styleId="AttributeTok" w:type="character">
+    <w:name w:val="AttributeTok"/>
+    <w:basedOn w:val="VerbatimChar"/>
+    <w:rPr>
+      <w:color w:val="7d9029"/>
+    </w:rPr>
+  </w:style>
+  <w:style w:customStyle="1" w:styleId="RegionMarkerTok" w:type="character">
+    <w:name w:val="RegionMarkerTok"/>
+    <w:basedOn w:val="VerbatimChar"/>
+    <w:rPr/>
+  </w:style>
+  <w:style w:customStyle="1" w:styleId="InformationTok" w:type="character">
+    <w:name w:val="InformationTok"/>
+    <w:basedOn w:val="VerbatimChar"/>
+    <w:rPr>
+      <w:b/>
+      <w:i/>
+      <w:color w:val="60a0b0"/>
+    </w:rPr>
+  </w:style>
+  <w:style w:customStyle="1" w:styleId="WarningTok" w:type="character">
+    <w:name w:val="WarningTok"/>
+    <w:basedOn w:val="VerbatimChar"/>
+    <w:rPr>
+      <w:b/>
+      <w:i/>
+      <w:color w:val="60a0b0"/>
+    </w:rPr>
+  </w:style>
+  <w:style w:customStyle="1" w:styleId="AlertTok" w:type="character">
+    <w:name w:val="AlertTok"/>
+    <w:basedOn w:val="VerbatimChar"/>
+    <w:rPr>
+      <w:b/>
+      <w:color w:val="ff0000"/>
+    </w:rPr>
+  </w:style>
+  <w:style w:customStyle="1" w:styleId="ErrorTok" w:type="character">
+    <w:name w:val="ErrorTok"/>
+    <w:basedOn w:val="VerbatimChar"/>
+    <w:rPr>
+      <w:b/>
+      <w:color w:val="ff0000"/>
+    </w:rPr>
+  </w:style>
+  <w:style w:customStyle="1" w:styleId="NormalTok" w:type="character">
+    <w:name w:val="NormalTok"/>
+    <w:basedOn w:val="VerbatimChar"/>
+    <w:rPr/>
   </w:style>
   <w:style w:type="character" w:customStyle="1" w:styleId="KeywordTok">
     <w:name w:val="KeywordTok"/>

</xml_diff>

<commit_message>
docs: actualizar guias y plantillas de agentes con resumen en vault
- Regla 7 ampliada en templates de gemini, copilot, cursor y comun
- Documentar carpeta apply/ del vault y exclusion en .gitignore en README, workflow y modo de uso
- Regenerar docs/modo-de-uso.docx

Spec-ID: resumen-apply-en-vault
</commit_message>
<xml_diff>
--- a/docs/modo-de-uso.docx
+++ b/docs/modo-de-uso.docx
@@ -4195,6 +4195,24 @@
           <w:rStyle w:val="VerbatimChar"/>
         </w:rPr>
         <w:t xml:space="preserve">      context.md                    ← estado actual del proyecto (actualizado continuamente)</w:t>
+      </w:r>
+      <w:r>
+        <w:br/>
+      </w:r>
+      <w:r>
+        <w:rPr>
+          <w:rStyle w:val="VerbatimChar"/>
+        </w:rPr>
+        <w:t xml:space="preserve">      apply\                        ← resúmenes del apply del Agente (local, no versionada por git)</w:t>
+      </w:r>
+      <w:r>
+        <w:br/>
+      </w:r>
+      <w:r>
+        <w:rPr>
+          <w:rStyle w:val="VerbatimChar"/>
+        </w:rPr>
+        <w:t xml:space="preserve">        AAAA-MM-DD-{change}.md</w:t>
       </w:r>
       <w:r>
         <w:br/>
@@ -4550,7 +4568,19 @@
               <w:t xml:space="preserve"> </w:t>
             </w:r>
             <w:r>
-              <w:t xml:space="preserve">con progreso</w:t>
+              <w:t xml:space="preserve">con progreso (el Agente escribe</w:t>
+            </w:r>
+            <w:r>
+              <w:t xml:space="preserve"> </w:t>
+            </w:r>
+            <w:r>
+              <w:rPr>
+                <w:rStyle w:val="VerbatimChar"/>
+              </w:rPr>
+              <w:t xml:space="preserve">apply\AAAA-MM-DD-{change}.md</w:t>
+            </w:r>
+            <w:r>
+              <w:t xml:space="preserve">)</w:t>
             </w:r>
           </w:p>
         </w:tc>
@@ -4633,7 +4663,10 @@
               <w:pStyle w:val="Compact"/>
             </w:pPr>
             <w:r>
-              <w:t xml:space="preserve">—</w:t>
+              <w:rPr>
+                <w:rStyle w:val="VerbatimChar"/>
+              </w:rPr>
+              <w:t xml:space="preserve">apply\AAAA-MM-DD-{change}.md</w:t>
             </w:r>
           </w:p>
         </w:tc>
@@ -4800,6 +4833,117 @@
       </w:r>
       <w:r>
         <w:t xml:space="preserve">se reescribe en cada operación.</w:t>
+      </w:r>
+    </w:p>
+    <w:p>
+      <w:pPr>
+        <w:pStyle w:val="Compact"/>
+        <w:numPr>
+          <w:ilvl w:val="0"/>
+          <w:numId w:val="1006"/>
+        </w:numPr>
+      </w:pPr>
+      <w:r>
+        <w:rPr>
+          <w:rStyle w:val="VerbatimChar"/>
+        </w:rPr>
+        <w:t xml:space="preserve">projects/*/apply/</w:t>
+      </w:r>
+      <w:r>
+        <w:t xml:space="preserve"> </w:t>
+      </w:r>
+      <w:r>
+        <w:t xml:space="preserve">está en el</w:t>
+      </w:r>
+      <w:r>
+        <w:t xml:space="preserve"> </w:t>
+      </w:r>
+      <w:r>
+        <w:rPr>
+          <w:rStyle w:val="VerbatimChar"/>
+        </w:rPr>
+        <w:t xml:space="preserve">.gitignore</w:t>
+      </w:r>
+      <w:r>
+        <w:t xml:space="preserve"> </w:t>
+      </w:r>
+      <w:r>
+        <w:t xml:space="preserve">del vault: las copias de los resúmenes del apply nunca se suben a git para evitar filtrar datos personales o credenciales fuera de la máquina. Por esta razón,</w:t>
+      </w:r>
+      <w:r>
+        <w:t xml:space="preserve"> </w:t>
+      </w:r>
+      <w:r>
+        <w:rPr>
+          <w:rStyle w:val="VerbatimChar"/>
+        </w:rPr>
+        <w:t xml:space="preserve">/opsx:verify</w:t>
+      </w:r>
+      <w:r>
+        <w:t xml:space="preserve"> </w:t>
+      </w:r>
+      <w:r>
+        <w:t xml:space="preserve">solo se corre en la máquina del apply.</w:t>
+      </w:r>
+    </w:p>
+    <w:p>
+      <w:pPr>
+        <w:pStyle w:val="Compact"/>
+        <w:numPr>
+          <w:ilvl w:val="0"/>
+          <w:numId w:val="1006"/>
+        </w:numPr>
+      </w:pPr>
+      <w:r>
+        <w:t xml:space="preserve">Al actualizar un proyecto existente o incorporar cambios a las reglas globales, hay que volver a copiar las plantillas de reglas (</w:t>
+      </w:r>
+      <w:r>
+        <w:rPr>
+          <w:rStyle w:val="VerbatimChar"/>
+        </w:rPr>
+        <w:t xml:space="preserve">.cursor/rules/sdd-workflow.mdc</w:t>
+      </w:r>
+      <w:r>
+        <w:t xml:space="preserve">,</w:t>
+      </w:r>
+      <w:r>
+        <w:t xml:space="preserve"> </w:t>
+      </w:r>
+      <w:r>
+        <w:rPr>
+          <w:rStyle w:val="VerbatimChar"/>
+        </w:rPr>
+        <w:t xml:space="preserve">.github/copilot-instructions.md</w:t>
+      </w:r>
+      <w:r>
+        <w:t xml:space="preserve">,</w:t>
+      </w:r>
+      <w:r>
+        <w:t xml:space="preserve"> </w:t>
+      </w:r>
+      <w:r>
+        <w:rPr>
+          <w:rStyle w:val="VerbatimChar"/>
+        </w:rPr>
+        <w:t xml:space="preserve">AGENTS.md</w:t>
+      </w:r>
+      <w:r>
+        <w:t xml:space="preserve">) y actualizar</w:t>
+      </w:r>
+      <w:r>
+        <w:t xml:space="preserve"> </w:t>
+      </w:r>
+      <w:r>
+        <w:rPr>
+          <w:rStyle w:val="VerbatimChar"/>
+        </w:rPr>
+        <w:t xml:space="preserve">GEMINI.md</w:t>
+      </w:r>
+      <w:r>
+        <w:t xml:space="preserve"> </w:t>
+      </w:r>
+      <w:r>
+        <w:t xml:space="preserve">en cada máquina.</w:t>
       </w:r>
     </w:p>
     <w:p>
@@ -7519,6 +7663,232 @@
     <w:basedOn w:val="VerbatimChar"/>
     <w:rPr/>
   </w:style>
+  <w:style w:type="character" w:customStyle="1" w:styleId="KeywordTok">
+    <w:name w:val="KeywordTok"/>
+    <w:basedOn w:val="VerbatimChar"/>
+    <w:rPr>
+      <w:b/>
+      <w:color w:val="007020"/>
+    </w:rPr>
+  </w:style>
+  <w:style w:type="character" w:customStyle="1" w:styleId="DataTypeTok">
+    <w:name w:val="DataTypeTok"/>
+    <w:basedOn w:val="VerbatimChar"/>
+    <w:rPr>
+      <w:color w:val="902000"/>
+    </w:rPr>
+  </w:style>
+  <w:style w:type="character" w:customStyle="1" w:styleId="DecValTok">
+    <w:name w:val="DecValTok"/>
+    <w:basedOn w:val="VerbatimChar"/>
+    <w:rPr>
+      <w:color w:val="40a070"/>
+    </w:rPr>
+  </w:style>
+  <w:style w:type="character" w:customStyle="1" w:styleId="BaseNTok">
+    <w:name w:val="BaseNTok"/>
+    <w:basedOn w:val="VerbatimChar"/>
+    <w:rPr>
+      <w:color w:val="40a070"/>
+    </w:rPr>
+  </w:style>
+  <w:style w:type="character" w:customStyle="1" w:styleId="FloatTok">
+    <w:name w:val="FloatTok"/>
+    <w:basedOn w:val="VerbatimChar"/>
+    <w:rPr>
+      <w:color w:val="40a070"/>
+    </w:rPr>
+  </w:style>
+  <w:style w:type="character" w:customStyle="1" w:styleId="ConstantTok">
+    <w:name w:val="ConstantTok"/>
+    <w:basedOn w:val="VerbatimChar"/>
+    <w:rPr>
+      <w:color w:val="880000"/>
+    </w:rPr>
+  </w:style>
+  <w:style w:type="character" w:customStyle="1" w:styleId="CharTok">
+    <w:name w:val="CharTok"/>
+    <w:basedOn w:val="VerbatimChar"/>
+    <w:rPr>
+      <w:color w:val="4070a0"/>
+    </w:rPr>
+  </w:style>
+  <w:style w:type="character" w:customStyle="1" w:styleId="SpecialCharTok">
+    <w:name w:val="SpecialCharTok"/>
+    <w:basedOn w:val="VerbatimChar"/>
+    <w:rPr>
+      <w:color w:val="4070a0"/>
+    </w:rPr>
+  </w:style>
+  <w:style w:type="character" w:customStyle="1" w:styleId="StringTok">
+    <w:name w:val="StringTok"/>
+    <w:basedOn w:val="VerbatimChar"/>
+    <w:rPr>
+      <w:color w:val="4070a0"/>
+    </w:rPr>
+  </w:style>
+  <w:style w:type="character" w:customStyle="1" w:styleId="VerbatimStringTok">
+    <w:name w:val="VerbatimStringTok"/>
+    <w:basedOn w:val="VerbatimChar"/>
+    <w:rPr>
+      <w:color w:val="4070a0"/>
+    </w:rPr>
+  </w:style>
+  <w:style w:type="character" w:customStyle="1" w:styleId="SpecialStringTok">
+    <w:name w:val="SpecialStringTok"/>
+    <w:basedOn w:val="VerbatimChar"/>
+    <w:rPr>
+      <w:color w:val="bb6688"/>
+    </w:rPr>
+  </w:style>
+  <w:style w:type="character" w:customStyle="1" w:styleId="ImportTok">
+    <w:name w:val="ImportTok"/>
+    <w:basedOn w:val="VerbatimChar"/>
+    <w:rPr>
+      <w:b/>
+      <w:color w:val="008000"/>
+    </w:rPr>
+  </w:style>
+  <w:style w:type="character" w:customStyle="1" w:styleId="CommentTok">
+    <w:name w:val="CommentTok"/>
+    <w:basedOn w:val="VerbatimChar"/>
+    <w:rPr>
+      <w:i/>
+      <w:color w:val="60a0b0"/>
+    </w:rPr>
+  </w:style>
+  <w:style w:type="character" w:customStyle="1" w:styleId="DocumentationTok">
+    <w:name w:val="DocumentationTok"/>
+    <w:basedOn w:val="VerbatimChar"/>
+    <w:rPr>
+      <w:i/>
+      <w:color w:val="ba2121"/>
+    </w:rPr>
+  </w:style>
+  <w:style w:type="character" w:customStyle="1" w:styleId="AnnotationTok">
+    <w:name w:val="AnnotationTok"/>
+    <w:basedOn w:val="VerbatimChar"/>
+    <w:rPr>
+      <w:b/>
+      <w:i/>
+      <w:color w:val="60a0b0"/>
+    </w:rPr>
+  </w:style>
+  <w:style w:type="character" w:customStyle="1" w:styleId="CommentVarTok">
+    <w:name w:val="CommentVarTok"/>
+    <w:basedOn w:val="VerbatimChar"/>
+    <w:rPr>
+      <w:b/>
+      <w:i/>
+      <w:color w:val="60a0b0"/>
+    </w:rPr>
+  </w:style>
+  <w:style w:type="character" w:customStyle="1" w:styleId="OtherTok">
+    <w:name w:val="OtherTok"/>
+    <w:basedOn w:val="VerbatimChar"/>
+    <w:rPr>
+      <w:color w:val="007020"/>
+    </w:rPr>
+  </w:style>
+  <w:style w:type="character" w:customStyle="1" w:styleId="FunctionTok">
+    <w:name w:val="FunctionTok"/>
+    <w:basedOn w:val="VerbatimChar"/>
+    <w:rPr>
+      <w:color w:val="06287e"/>
+    </w:rPr>
+  </w:style>
+  <w:style w:type="character" w:customStyle="1" w:styleId="VariableTok">
+    <w:name w:val="VariableTok"/>
+    <w:basedOn w:val="VerbatimChar"/>
+    <w:rPr>
+      <w:color w:val="19177c"/>
+    </w:rPr>
+  </w:style>
+  <w:style w:type="character" w:customStyle="1" w:styleId="ControlFlowTok">
+    <w:name w:val="ControlFlowTok"/>
+    <w:basedOn w:val="VerbatimChar"/>
+    <w:rPr>
+      <w:b/>
+      <w:color w:val="007020"/>
+    </w:rPr>
+  </w:style>
+  <w:style w:type="character" w:customStyle="1" w:styleId="OperatorTok">
+    <w:name w:val="OperatorTok"/>
+    <w:basedOn w:val="VerbatimChar"/>
+    <w:rPr>
+      <w:color w:val="666666"/>
+    </w:rPr>
+  </w:style>
+  <w:style w:type="character" w:customStyle="1" w:styleId="BuiltInTok">
+    <w:name w:val="BuiltInTok"/>
+    <w:basedOn w:val="VerbatimChar"/>
+    <w:rPr>
+      <w:color w:val="008000"/>
+    </w:rPr>
+  </w:style>
+  <w:style w:type="character" w:customStyle="1" w:styleId="ExtensionTok">
+    <w:name w:val="ExtensionTok"/>
+    <w:basedOn w:val="VerbatimChar"/>
+    <w:rPr/>
+  </w:style>
+  <w:style w:type="character" w:customStyle="1" w:styleId="PreprocessorTok">
+    <w:name w:val="PreprocessorTok"/>
+    <w:basedOn w:val="VerbatimChar"/>
+    <w:rPr>
+      <w:color w:val="bc7a00"/>
+    </w:rPr>
+  </w:style>
+  <w:style w:type="character" w:customStyle="1" w:styleId="AttributeTok">
+    <w:name w:val="AttributeTok"/>
+    <w:basedOn w:val="VerbatimChar"/>
+    <w:rPr>
+      <w:color w:val="7d9029"/>
+    </w:rPr>
+  </w:style>
+  <w:style w:type="character" w:customStyle="1" w:styleId="RegionMarkerTok">
+    <w:name w:val="RegionMarkerTok"/>
+    <w:basedOn w:val="VerbatimChar"/>
+    <w:rPr/>
+  </w:style>
+  <w:style w:type="character" w:customStyle="1" w:styleId="InformationTok">
+    <w:name w:val="InformationTok"/>
+    <w:basedOn w:val="VerbatimChar"/>
+    <w:rPr>
+      <w:b/>
+      <w:i/>
+      <w:color w:val="60a0b0"/>
+    </w:rPr>
+  </w:style>
+  <w:style w:type="character" w:customStyle="1" w:styleId="WarningTok">
+    <w:name w:val="WarningTok"/>
+    <w:basedOn w:val="VerbatimChar"/>
+    <w:rPr>
+      <w:b/>
+      <w:i/>
+      <w:color w:val="60a0b0"/>
+    </w:rPr>
+  </w:style>
+  <w:style w:type="character" w:customStyle="1" w:styleId="AlertTok">
+    <w:name w:val="AlertTok"/>
+    <w:basedOn w:val="VerbatimChar"/>
+    <w:rPr>
+      <w:b/>
+      <w:color w:val="ff0000"/>
+    </w:rPr>
+  </w:style>
+  <w:style w:type="character" w:customStyle="1" w:styleId="ErrorTok">
+    <w:name w:val="ErrorTok"/>
+    <w:basedOn w:val="VerbatimChar"/>
+    <w:rPr>
+      <w:b/>
+      <w:color w:val="ff0000"/>
+    </w:rPr>
+  </w:style>
+  <w:style w:type="character" w:customStyle="1" w:styleId="NormalTok">
+    <w:name w:val="NormalTok"/>
+    <w:basedOn w:val="VerbatimChar"/>
+    <w:rPr/>
+  </w:style>
 </w:styles>
 </file>
 

</xml_diff>

<commit_message>
docs: mover GEMINI.md a templates/antigravity y retirar Gemini CLI
Spec-ID: retirar-gemini-cli
</commit_message>
<xml_diff>
--- a/docs/modo-de-uso.docx
+++ b/docs/modo-de-uso.docx
@@ -2769,7 +2769,7 @@
         <w:rPr>
           <w:rStyle w:val="NormalTok"/>
         </w:rPr>
-        <w:t xml:space="preserve"> templates\gemini\GEMINI</w:t>
+        <w:t xml:space="preserve"> templates\antigravity\GEMINI</w:t>
       </w:r>
       <w:r>
         <w:rPr>
@@ -8681,6 +8681,232 @@
     <w:basedOn w:val="VerbatimChar"/>
     <w:rPr/>
   </w:style>
+  <w:style w:type="character" w:customStyle="1" w:styleId="KeywordTok">
+    <w:name w:val="KeywordTok"/>
+    <w:basedOn w:val="VerbatimChar"/>
+    <w:rPr>
+      <w:b/>
+      <w:color w:val="007020"/>
+    </w:rPr>
+  </w:style>
+  <w:style w:type="character" w:customStyle="1" w:styleId="DataTypeTok">
+    <w:name w:val="DataTypeTok"/>
+    <w:basedOn w:val="VerbatimChar"/>
+    <w:rPr>
+      <w:color w:val="902000"/>
+    </w:rPr>
+  </w:style>
+  <w:style w:type="character" w:customStyle="1" w:styleId="DecValTok">
+    <w:name w:val="DecValTok"/>
+    <w:basedOn w:val="VerbatimChar"/>
+    <w:rPr>
+      <w:color w:val="40a070"/>
+    </w:rPr>
+  </w:style>
+  <w:style w:type="character" w:customStyle="1" w:styleId="BaseNTok">
+    <w:name w:val="BaseNTok"/>
+    <w:basedOn w:val="VerbatimChar"/>
+    <w:rPr>
+      <w:color w:val="40a070"/>
+    </w:rPr>
+  </w:style>
+  <w:style w:type="character" w:customStyle="1" w:styleId="FloatTok">
+    <w:name w:val="FloatTok"/>
+    <w:basedOn w:val="VerbatimChar"/>
+    <w:rPr>
+      <w:color w:val="40a070"/>
+    </w:rPr>
+  </w:style>
+  <w:style w:type="character" w:customStyle="1" w:styleId="ConstantTok">
+    <w:name w:val="ConstantTok"/>
+    <w:basedOn w:val="VerbatimChar"/>
+    <w:rPr>
+      <w:color w:val="880000"/>
+    </w:rPr>
+  </w:style>
+  <w:style w:type="character" w:customStyle="1" w:styleId="CharTok">
+    <w:name w:val="CharTok"/>
+    <w:basedOn w:val="VerbatimChar"/>
+    <w:rPr>
+      <w:color w:val="4070a0"/>
+    </w:rPr>
+  </w:style>
+  <w:style w:type="character" w:customStyle="1" w:styleId="SpecialCharTok">
+    <w:name w:val="SpecialCharTok"/>
+    <w:basedOn w:val="VerbatimChar"/>
+    <w:rPr>
+      <w:color w:val="4070a0"/>
+    </w:rPr>
+  </w:style>
+  <w:style w:type="character" w:customStyle="1" w:styleId="StringTok">
+    <w:name w:val="StringTok"/>
+    <w:basedOn w:val="VerbatimChar"/>
+    <w:rPr>
+      <w:color w:val="4070a0"/>
+    </w:rPr>
+  </w:style>
+  <w:style w:type="character" w:customStyle="1" w:styleId="VerbatimStringTok">
+    <w:name w:val="VerbatimStringTok"/>
+    <w:basedOn w:val="VerbatimChar"/>
+    <w:rPr>
+      <w:color w:val="4070a0"/>
+    </w:rPr>
+  </w:style>
+  <w:style w:type="character" w:customStyle="1" w:styleId="SpecialStringTok">
+    <w:name w:val="SpecialStringTok"/>
+    <w:basedOn w:val="VerbatimChar"/>
+    <w:rPr>
+      <w:color w:val="bb6688"/>
+    </w:rPr>
+  </w:style>
+  <w:style w:type="character" w:customStyle="1" w:styleId="ImportTok">
+    <w:name w:val="ImportTok"/>
+    <w:basedOn w:val="VerbatimChar"/>
+    <w:rPr>
+      <w:b/>
+      <w:color w:val="008000"/>
+    </w:rPr>
+  </w:style>
+  <w:style w:type="character" w:customStyle="1" w:styleId="CommentTok">
+    <w:name w:val="CommentTok"/>
+    <w:basedOn w:val="VerbatimChar"/>
+    <w:rPr>
+      <w:i/>
+      <w:color w:val="60a0b0"/>
+    </w:rPr>
+  </w:style>
+  <w:style w:type="character" w:customStyle="1" w:styleId="DocumentationTok">
+    <w:name w:val="DocumentationTok"/>
+    <w:basedOn w:val="VerbatimChar"/>
+    <w:rPr>
+      <w:i/>
+      <w:color w:val="ba2121"/>
+    </w:rPr>
+  </w:style>
+  <w:style w:type="character" w:customStyle="1" w:styleId="AnnotationTok">
+    <w:name w:val="AnnotationTok"/>
+    <w:basedOn w:val="VerbatimChar"/>
+    <w:rPr>
+      <w:b/>
+      <w:i/>
+      <w:color w:val="60a0b0"/>
+    </w:rPr>
+  </w:style>
+  <w:style w:type="character" w:customStyle="1" w:styleId="CommentVarTok">
+    <w:name w:val="CommentVarTok"/>
+    <w:basedOn w:val="VerbatimChar"/>
+    <w:rPr>
+      <w:b/>
+      <w:i/>
+      <w:color w:val="60a0b0"/>
+    </w:rPr>
+  </w:style>
+  <w:style w:type="character" w:customStyle="1" w:styleId="OtherTok">
+    <w:name w:val="OtherTok"/>
+    <w:basedOn w:val="VerbatimChar"/>
+    <w:rPr>
+      <w:color w:val="007020"/>
+    </w:rPr>
+  </w:style>
+  <w:style w:type="character" w:customStyle="1" w:styleId="FunctionTok">
+    <w:name w:val="FunctionTok"/>
+    <w:basedOn w:val="VerbatimChar"/>
+    <w:rPr>
+      <w:color w:val="06287e"/>
+    </w:rPr>
+  </w:style>
+  <w:style w:type="character" w:customStyle="1" w:styleId="VariableTok">
+    <w:name w:val="VariableTok"/>
+    <w:basedOn w:val="VerbatimChar"/>
+    <w:rPr>
+      <w:color w:val="19177c"/>
+    </w:rPr>
+  </w:style>
+  <w:style w:type="character" w:customStyle="1" w:styleId="ControlFlowTok">
+    <w:name w:val="ControlFlowTok"/>
+    <w:basedOn w:val="VerbatimChar"/>
+    <w:rPr>
+      <w:b/>
+      <w:color w:val="007020"/>
+    </w:rPr>
+  </w:style>
+  <w:style w:type="character" w:customStyle="1" w:styleId="OperatorTok">
+    <w:name w:val="OperatorTok"/>
+    <w:basedOn w:val="VerbatimChar"/>
+    <w:rPr>
+      <w:color w:val="666666"/>
+    </w:rPr>
+  </w:style>
+  <w:style w:type="character" w:customStyle="1" w:styleId="BuiltInTok">
+    <w:name w:val="BuiltInTok"/>
+    <w:basedOn w:val="VerbatimChar"/>
+    <w:rPr>
+      <w:color w:val="008000"/>
+    </w:rPr>
+  </w:style>
+  <w:style w:type="character" w:customStyle="1" w:styleId="ExtensionTok">
+    <w:name w:val="ExtensionTok"/>
+    <w:basedOn w:val="VerbatimChar"/>
+    <w:rPr/>
+  </w:style>
+  <w:style w:type="character" w:customStyle="1" w:styleId="PreprocessorTok">
+    <w:name w:val="PreprocessorTok"/>
+    <w:basedOn w:val="VerbatimChar"/>
+    <w:rPr>
+      <w:color w:val="bc7a00"/>
+    </w:rPr>
+  </w:style>
+  <w:style w:type="character" w:customStyle="1" w:styleId="AttributeTok">
+    <w:name w:val="AttributeTok"/>
+    <w:basedOn w:val="VerbatimChar"/>
+    <w:rPr>
+      <w:color w:val="7d9029"/>
+    </w:rPr>
+  </w:style>
+  <w:style w:type="character" w:customStyle="1" w:styleId="RegionMarkerTok">
+    <w:name w:val="RegionMarkerTok"/>
+    <w:basedOn w:val="VerbatimChar"/>
+    <w:rPr/>
+  </w:style>
+  <w:style w:type="character" w:customStyle="1" w:styleId="InformationTok">
+    <w:name w:val="InformationTok"/>
+    <w:basedOn w:val="VerbatimChar"/>
+    <w:rPr>
+      <w:b/>
+      <w:i/>
+      <w:color w:val="60a0b0"/>
+    </w:rPr>
+  </w:style>
+  <w:style w:type="character" w:customStyle="1" w:styleId="WarningTok">
+    <w:name w:val="WarningTok"/>
+    <w:basedOn w:val="VerbatimChar"/>
+    <w:rPr>
+      <w:b/>
+      <w:i/>
+      <w:color w:val="60a0b0"/>
+    </w:rPr>
+  </w:style>
+  <w:style w:type="character" w:customStyle="1" w:styleId="AlertTok">
+    <w:name w:val="AlertTok"/>
+    <w:basedOn w:val="VerbatimChar"/>
+    <w:rPr>
+      <w:b/>
+      <w:color w:val="ff0000"/>
+    </w:rPr>
+  </w:style>
+  <w:style w:type="character" w:customStyle="1" w:styleId="ErrorTok">
+    <w:name w:val="ErrorTok"/>
+    <w:basedOn w:val="VerbatimChar"/>
+    <w:rPr>
+      <w:b/>
+      <w:color w:val="ff0000"/>
+    </w:rPr>
+  </w:style>
+  <w:style w:type="character" w:customStyle="1" w:styleId="NormalTok">
+    <w:name w:val="NormalTok"/>
+    <w:basedOn w:val="VerbatimChar"/>
+    <w:rPr/>
+  </w:style>
 </w:styles>
 </file>
 

</xml_diff>